<commit_message>
docs(report): regenerate Word docx from current markdown chapters
Refreshes essay/CPT204-Group22-Report.docx via the same pandoc pipeline
(reference doc /tmp/reference-styled.docx, Calibri 12 / line 1.5,
chapters 01-07 in order). Picks up any latest edits in the seven source
markdown files so the submitted Word artefact stays in sync.

Co-Authored-By: Claude Opus 4.7 <noreply@anthropic.com>
</commit_message>
<xml_diff>
--- a/essay/CPT204-Group22-Report.docx
+++ b/essay/CPT204-Group22-Report.docx
@@ -2,20 +2,64 @@
 <file path=word/document.xml><?xml version="1.0" encoding="utf-8"?>
 <w:document xmlns:w="http://schemas.openxmlformats.org/wordprocessingml/2006/main" xmlns:m="http://schemas.openxmlformats.org/officeDocument/2006/math" xmlns:r="http://schemas.openxmlformats.org/officeDocument/2006/relationships" xmlns:o="urn:schemas-microsoft-com:office:office" xmlns:v="urn:schemas-microsoft-com:vml" xmlns:w10="urn:schemas-microsoft-com:office:word" xmlns:a="http://schemas.openxmlformats.org/drawingml/2006/main" xmlns:pic="http://schemas.openxmlformats.org/drawingml/2006/picture" xmlns:wp="http://schemas.openxmlformats.org/drawingml/2006/wordprocessingDrawing">
   <w:body>
-    <w:bookmarkStart w:id="20" w:name="chapter-1--sorting-algorithm-task-a"/>
+    <w:sdt>
+      <w:sdtPr>
+        <w:docPartObj>
+          <w:docPartGallery w:val="Table of Contents"/>
+          <w:docPartUnique/>
+        </w:docPartObj>
+      </w:sdtPr>
+      <w:sdtContent>
+        <w:p>
+          <w:pPr>
+            <w:pStyle w:val="TOCHeading"/>
+          </w:pPr>
+          <w:r>
+            <w:t xml:space="preserve">Table of Contents</w:t>
+          </w:r>
+        </w:p>
+        <w:p>
+          <w:r>
+            <w:fldChar w:fldCharType="begin" w:dirty="true"/>
+            <w:instrText xml:space="preserve">TOC \o "1-2" \h \z \u</w:instrText>
+            <w:fldChar w:fldCharType="separate"/>
+            <w:fldChar w:fldCharType="end"/>
+          </w:r>
+        </w:p>
+      </w:sdtContent>
+    </w:sdt>
+    <w:bookmarkStart w:id="20" w:name="chapter-1-sorting-algorithm-task-a"/>
     <w:p>
       <w:pPr>
         <w:pStyle w:val="Heading1"/>
       </w:pPr>
       <w:r>
+        <w:rPr>
+          <w:rStyle w:val="SectionNumber"/>
+        </w:rPr>
+        <w:t xml:space="preserve">1</w:t>
+      </w:r>
+      <w:r>
+        <w:tab/>
+      </w:r>
+      <w:r>
         <w:t xml:space="preserve">Chapter 1 — Sorting Algorithm (Task A)</w:t>
       </w:r>
     </w:p>
-    <w:bookmarkStart w:id="11" w:name="Xadf3fbf2c2acdd6bcf548ff546b43f2b7d42c87"/>
+    <w:bookmarkStart w:id="11" w:name="X9439abbd3bcb8102215b1d4d002af01a7a5fb50"/>
     <w:p>
       <w:pPr>
         <w:pStyle w:val="Heading2"/>
       </w:pPr>
+      <w:r>
+        <w:rPr>
+          <w:rStyle w:val="SectionNumber"/>
+        </w:rPr>
+        <w:t xml:space="preserve">1.1</w:t>
+      </w:r>
+      <w:r>
+        <w:tab/>
+      </w:r>
       <w:r>
         <w:t xml:space="preserve">1.1 Implementation, Methodology, and Comparison</w:t>
       </w:r>
@@ -85,7 +129,7 @@
         <w:t xml:space="preserve">Comparator&lt;? super T&gt;</w:t>
       </w:r>
       <w:r>
-        <w:t xml:space="preserve">, so the project's ranking rule</w:t>
+        <w:t xml:space="preserve">, so the project’s ranking rule</w:t>
       </w:r>
       <w:r>
         <w:t xml:space="preserve"> </w:t>
@@ -314,6 +358,15 @@
         <w:pStyle w:val="Heading3"/>
       </w:pPr>
       <w:r>
+        <w:rPr>
+          <w:rStyle w:val="SectionNumber"/>
+        </w:rPr>
+        <w:t xml:space="preserve">1.1.1</w:t>
+      </w:r>
+      <w:r>
+        <w:tab/>
+      </w:r>
+      <w:r>
         <w:t xml:space="preserve">Measurement methodology</w:t>
       </w:r>
     </w:p>
@@ -508,13 +561,23 @@
         <w:pStyle w:val="Heading3"/>
       </w:pPr>
       <w:r>
+        <w:rPr>
+          <w:rStyle w:val="SectionNumber"/>
+        </w:rPr>
+        <w:t xml:space="preserve">1.1.2</w:t>
+      </w:r>
+      <w:r>
+        <w:tab/>
+      </w:r>
+      <w:r>
         <w:t xml:space="preserve">Required Output</w:t>
       </w:r>
     </w:p>
     <w:tbl>
       <w:tblPr>
         <w:tblStyle w:val="Table"/>
-        <w:tblW w:type="auto" w:w="0"/>
+        <w:tblW w:type="pct" w:w="5000"/>
+        <w:tblLayout w:type="fixed"/>
         <w:tblLook w:firstRow="1" w:lastRow="0" w:firstColumn="0" w:lastColumn="0" w:noHBand="0" w:noVBand="0" w:val="0020"/>
       </w:tblPr>
       <w:tblGrid>
@@ -784,11 +847,20 @@
     </w:p>
     <w:bookmarkEnd w:id="10"/>
     <w:bookmarkEnd w:id="11"/>
-    <w:bookmarkStart w:id="15" w:name="Xb713d3fe2b7a5cda914dc18b45839f76359b637"/>
+    <w:bookmarkStart w:id="15" w:name="analysis-of-dataset-properties"/>
     <w:p>
       <w:pPr>
         <w:pStyle w:val="Heading2"/>
       </w:pPr>
+      <w:r>
+        <w:rPr>
+          <w:rStyle w:val="SectionNumber"/>
+        </w:rPr>
+        <w:t xml:space="preserve">1.2</w:t>
+      </w:r>
+      <w:r>
+        <w:tab/>
+      </w:r>
       <w:r>
         <w:t xml:space="preserve">1.2 Analysis of Dataset Properties</w:t>
       </w:r>
@@ -799,6 +871,15 @@
         <w:pStyle w:val="Heading3"/>
       </w:pPr>
       <w:r>
+        <w:rPr>
+          <w:rStyle w:val="SectionNumber"/>
+        </w:rPr>
+        <w:t xml:space="preserve">1.2.1</w:t>
+      </w:r>
+      <w:r>
+        <w:tab/>
+      </w:r>
+      <w:r>
         <w:t xml:space="preserve">How does the initial order affect performance?</w:t>
       </w:r>
     </w:p>
@@ -1033,7 +1114,19 @@
         <w:t xml:space="preserve"> </w:t>
       </w:r>
       <w:r>
-        <w:t xml:space="preserve">ties than ideal due to many "equal-to-pivot" elements clustering on one</w:t>
+        <w:t xml:space="preserve">ties than ideal due to many</w:t>
+      </w:r>
+      <w:r>
+        <w:t xml:space="preserve"> </w:t>
+      </w:r>
+      <w:r>
+        <w:t xml:space="preserve">“equal-to-pivot”</w:t>
+      </w:r>
+      <w:r>
+        <w:t xml:space="preserve"> </w:t>
+      </w:r>
+      <w:r>
+        <w:t xml:space="preserve">elements clustering on one</w:t>
       </w:r>
       <w:r>
         <w:t xml:space="preserve"> </w:t>
@@ -1060,6 +1153,15 @@
       <w:pPr>
         <w:pStyle w:val="Heading3"/>
       </w:pPr>
+      <w:r>
+        <w:rPr>
+          <w:rStyle w:val="SectionNumber"/>
+        </w:rPr>
+        <w:t xml:space="preserve">1.2.2</w:t>
+      </w:r>
+      <w:r>
+        <w:tab/>
+      </w:r>
       <w:r>
         <w:t xml:space="preserve">Which algorithm performs best on each dataset?</w:t>
       </w:r>
@@ -1169,6 +1271,15 @@
         <w:pStyle w:val="Heading3"/>
       </w:pPr>
       <w:r>
+        <w:rPr>
+          <w:rStyle w:val="SectionNumber"/>
+        </w:rPr>
+        <w:t xml:space="preserve">1.2.3</w:t>
+      </w:r>
+      <w:r>
+        <w:tab/>
+      </w:r>
+      <w:r>
         <w:t xml:space="preserve">Which algorithm behaves most consistently?</w:t>
       </w:r>
     </w:p>
@@ -1189,7 +1300,7 @@
         <w:t xml:space="preserve"> </w:t>
       </w:r>
       <w:r>
-        <w:t xml:space="preserve">structural: Merge Sort's recursion tree depth is exactly ⌈log₂ n⌉ and</w:t>
+        <w:t xml:space="preserve">structural: Merge Sort’s recursion tree depth is exactly ⌈log₂ n⌉ and</w:t>
       </w:r>
       <w:r>
         <w:t xml:space="preserve"> </w:t>
@@ -1201,7 +1312,7 @@
         <w:t xml:space="preserve"> </w:t>
       </w:r>
       <w:r>
-        <w:t xml:space="preserve">It has no best-case shortcut (unlike Bubble Sort's early-exit) and no</w:t>
+        <w:t xml:space="preserve">It has no best-case shortcut (unlike Bubble Sort’s early-exit) and no</w:t>
       </w:r>
       <w:r>
         <w:t xml:space="preserve"> </w:t>
@@ -1215,7 +1326,7 @@
         <w:pStyle w:val="BodyText"/>
       </w:pPr>
       <w:r>
-        <w:t xml:space="preserve">By contrast, Bubble Sort's spread is 0.103 to 3.169 ms (≈ 31×) — it is</w:t>
+        <w:t xml:space="preserve">By contrast, Bubble Sort’s spread is 0.103 to 3.169 ms (≈ 31×) — it is</w:t>
       </w:r>
       <w:r>
         <w:t xml:space="preserve"> </w:t>
@@ -1237,7 +1348,7 @@
         <w:t xml:space="preserve"> </w:t>
       </w:r>
       <w:r>
-        <w:t xml:space="preserve">consistent algorithm. Quick Sort's spread is 0.072 to</w:t>
+        <w:t xml:space="preserve">consistent algorithm. Quick Sort’s spread is 0.072 to</w:t>
       </w:r>
       <w:r>
         <w:t xml:space="preserve"> </w:t>
@@ -1254,11 +1365,20 @@
     </w:p>
     <w:bookmarkEnd w:id="14"/>
     <w:bookmarkEnd w:id="15"/>
-    <w:bookmarkStart w:id="19" w:name="Xb2217a801a25de641baee7ee6c468f284884437"/>
+    <w:bookmarkStart w:id="19" w:name="justification-of-algorithm-choice"/>
     <w:p>
       <w:pPr>
         <w:pStyle w:val="Heading2"/>
       </w:pPr>
+      <w:r>
+        <w:rPr>
+          <w:rStyle w:val="SectionNumber"/>
+        </w:rPr>
+        <w:t xml:space="preserve">1.3</w:t>
+      </w:r>
+      <w:r>
+        <w:tab/>
+      </w:r>
       <w:r>
         <w:t xml:space="preserve">1.3 Justification of Algorithm Choice</w:t>
       </w:r>
@@ -1268,6 +1388,15 @@
       <w:pPr>
         <w:pStyle w:val="Heading3"/>
       </w:pPr>
+      <w:r>
+        <w:rPr>
+          <w:rStyle w:val="SectionNumber"/>
+        </w:rPr>
+        <w:t xml:space="preserve">1.3.1</w:t>
+      </w:r>
+      <w:r>
+        <w:tab/>
+      </w:r>
       <w:r>
         <w:t xml:space="preserve">If only one algorithm could be chosen for the final system</w:t>
       </w:r>
@@ -1354,7 +1483,7 @@
         <w:t xml:space="preserve"> </w:t>
       </w:r>
       <w:r>
-        <w:t xml:space="preserve">slower). Quick Sort's median-of-three eliminates Bubble Sort's</w:t>
+        <w:t xml:space="preserve">slower). Quick Sort’s median-of-three eliminates Bubble Sort’s</w:t>
       </w:r>
       <w:r>
         <w:t xml:space="preserve"> </w:t>
@@ -1406,13 +1535,13 @@
         <w:t xml:space="preserve"> </w:t>
       </w:r>
       <w:r>
-        <w:t xml:space="preserve">because Merge Sort's auxiliary-buffer writes have worse cache</w:t>
-      </w:r>
-      <w:r>
-        <w:t xml:space="preserve"> </w:t>
-      </w:r>
-      <w:r>
-        <w:t xml:space="preserve">locality than Quick Sort's in-place swaps.</w:t>
+        <w:t xml:space="preserve">because Merge Sort’s auxiliary-buffer writes have worse cache</w:t>
+      </w:r>
+      <w:r>
+        <w:t xml:space="preserve"> </w:t>
+      </w:r>
+      <w:r>
+        <w:t xml:space="preserve">locality than Quick Sort’s in-place swaps.</w:t>
       </w:r>
     </w:p>
     <w:p>
@@ -1456,6 +1585,15 @@
         <w:pStyle w:val="Heading3"/>
       </w:pPr>
       <w:r>
+        <w:rPr>
+          <w:rStyle w:val="SectionNumber"/>
+        </w:rPr>
+        <w:t xml:space="preserve">1.3.2</w:t>
+      </w:r>
+      <w:r>
+        <w:tab/>
+      </w:r>
+      <w:r>
         <w:t xml:space="preserve">Scaling: if n becomes much larger</w:t>
       </w:r>
     </w:p>
@@ -1628,6 +1766,15 @@
       <w:pPr>
         <w:pStyle w:val="Heading3"/>
       </w:pPr>
+      <w:r>
+        <w:rPr>
+          <w:rStyle w:val="SectionNumber"/>
+        </w:rPr>
+        <w:t xml:space="preserve">1.3.3</w:t>
+      </w:r>
+      <w:r>
+        <w:tab/>
+      </w:r>
       <w:r>
         <w:t xml:space="preserve">Joint consideration of runtime and memory</w:t>
       </w:r>
@@ -1851,7 +1998,7 @@
         <w:pStyle w:val="BodyText"/>
       </w:pPr>
       <w:r>
-        <w:t xml:space="preserve">Merge Sort's main weakness for the inspection system is the O(n)</w:t>
+        <w:t xml:space="preserve">Merge Sort’s main weakness for the inspection system is the O(n)</w:t>
       </w:r>
       <w:r>
         <w:t xml:space="preserve"> </w:t>
@@ -1980,20 +2127,38 @@
     <w:bookmarkEnd w:id="18"/>
     <w:bookmarkEnd w:id="19"/>
     <w:bookmarkEnd w:id="20"/>
-    <w:bookmarkStart w:id="36" w:name="chapter-2--graph-algorithm-task-b"/>
+    <w:bookmarkStart w:id="36" w:name="chapter-2-graph-algorithm-task-b"/>
     <w:p>
       <w:pPr>
         <w:pStyle w:val="Heading1"/>
       </w:pPr>
       <w:r>
+        <w:rPr>
+          <w:rStyle w:val="SectionNumber"/>
+        </w:rPr>
+        <w:t xml:space="preserve">2</w:t>
+      </w:r>
+      <w:r>
+        <w:tab/>
+      </w:r>
+      <w:r>
         <w:t xml:space="preserve">Chapter 2 — Graph Algorithm (Task B)</w:t>
       </w:r>
     </w:p>
-    <w:bookmarkStart w:id="21" w:name="Xc16b09d1c0ab01bada9e305d64452c43dc02871"/>
+    <w:bookmarkStart w:id="21" w:name="constructing-the-weighted-graph"/>
     <w:p>
       <w:pPr>
         <w:pStyle w:val="Heading2"/>
       </w:pPr>
+      <w:r>
+        <w:rPr>
+          <w:rStyle w:val="SectionNumber"/>
+        </w:rPr>
+        <w:t xml:space="preserve">2.1</w:t>
+      </w:r>
+      <w:r>
+        <w:tab/>
+      </w:r>
       <w:r>
         <w:t xml:space="preserve">2.1 Constructing the Weighted Graph</w:t>
       </w:r>
@@ -2093,7 +2258,7 @@
         <w:t xml:space="preserve"> </w:t>
       </w:r>
       <w:r>
-        <w:t xml:space="preserve">necessary precondition for Dijkstra's algorithm (see §2.3 below).</w:t>
+        <w:t xml:space="preserve">necessary precondition for Dijkstra’s algorithm (see §2.3 below).</w:t>
       </w:r>
     </w:p>
     <w:p>
@@ -2194,19 +2359,29 @@
       </w:r>
     </w:p>
     <w:bookmarkEnd w:id="21"/>
-    <w:bookmarkStart w:id="22" w:name="X0bb2cdedb918d26cb3729c30dfcdf7ccedd5e07"/>
+    <w:bookmarkStart w:id="22" w:name="required-output-four-shortest-path-cases"/>
     <w:p>
       <w:pPr>
         <w:pStyle w:val="Heading2"/>
       </w:pPr>
       <w:r>
+        <w:rPr>
+          <w:rStyle w:val="SectionNumber"/>
+        </w:rPr>
+        <w:t xml:space="preserve">2.2</w:t>
+      </w:r>
+      <w:r>
+        <w:tab/>
+      </w:r>
+      <w:r>
         <w:t xml:space="preserve">2.2 Required Output — Four Shortest-Path Cases</w:t>
       </w:r>
     </w:p>
     <w:tbl>
       <w:tblPr>
         <w:tblStyle w:val="Table"/>
-        <w:tblW w:type="auto" w:w="0"/>
+        <w:tblW w:type="pct" w:w="5000"/>
+        <w:tblLayout w:type="fixed"/>
         <w:tblLook w:firstRow="1" w:lastRow="0" w:firstColumn="0" w:lastColumn="0" w:noHBand="0" w:noVBand="0" w:val="0020"/>
       </w:tblPr>
       <w:tblGrid>
@@ -2678,13 +2853,22 @@
         <w:t xml:space="preserve"> </w:t>
       </w:r>
       <w:r>
-        <w:t xml:space="preserve">loop, which is the conventional and correct interpretation of "the</w:t>
-      </w:r>
-      <w:r>
-        <w:t xml:space="preserve"> </w:t>
-      </w:r>
-      <w:r>
-        <w:t xml:space="preserve">shortest path from a node to itself".</w:t>
+        <w:t xml:space="preserve">loop, which is the conventional and correct interpretation of</w:t>
+      </w:r>
+      <w:r>
+        <w:t xml:space="preserve"> </w:t>
+      </w:r>
+      <w:r>
+        <w:t xml:space="preserve">“the</w:t>
+      </w:r>
+      <w:r>
+        <w:t xml:space="preserve"> </w:t>
+      </w:r>
+      <w:r>
+        <w:t xml:space="preserve">shortest path from a node to itself”</w:t>
+      </w:r>
+      <w:r>
+        <w:t xml:space="preserve">.</w:t>
       </w:r>
     </w:p>
     <w:p>
@@ -2745,7 +2929,7 @@
         <w:t xml:space="preserve"> </w:t>
       </w:r>
       <w:r>
-        <w:t xml:space="preserve">i.e. it walks into the waypoint and then out again along the same</w:t>
+        <w:t xml:space="preserve">i.e. it walks into the waypoint and then out again along the same</w:t>
       </w:r>
       <w:r>
         <w:t xml:space="preserve"> </w:t>
@@ -2794,11 +2978,20 @@
       </w:r>
     </w:p>
     <w:bookmarkEnd w:id="22"/>
-    <w:bookmarkStart w:id="28" w:name="X0593ca5b2fe275805c1a1d55a3a34ed7335c029"/>
+    <w:bookmarkStart w:id="28" w:name="X699849ead7badafd6bb274f35c3ac21c14e8957"/>
     <w:p>
       <w:pPr>
         <w:pStyle w:val="Heading2"/>
       </w:pPr>
+      <w:r>
+        <w:rPr>
+          <w:rStyle w:val="SectionNumber"/>
+        </w:rPr>
+        <w:t xml:space="preserve">2.3</w:t>
+      </w:r>
+      <w:r>
+        <w:tab/>
+      </w:r>
       <w:r>
         <w:t xml:space="preserve">2.3 Algorithm: Dijkstra with a Binary-Heap Priority Queue</w:t>
       </w:r>
@@ -2808,7 +3001,7 @@
         <w:pStyle w:val="FirstParagraph"/>
       </w:pPr>
       <w:r>
-        <w:t xml:space="preserve">We use Dijkstra's single-source shortest-path algorithm, implemented</w:t>
+        <w:t xml:space="preserve">We use Dijkstra’s single-source shortest-path algorithm, implemented</w:t>
       </w:r>
       <w:r>
         <w:t xml:space="preserve"> </w:t>
@@ -2843,6 +3036,15 @@
       <w:pPr>
         <w:pStyle w:val="Heading3"/>
       </w:pPr>
+      <w:r>
+        <w:rPr>
+          <w:rStyle w:val="SectionNumber"/>
+        </w:rPr>
+        <w:t xml:space="preserve">2.3.1</w:t>
+      </w:r>
+      <w:r>
+        <w:tab/>
+      </w:r>
       <w:r>
         <w:t xml:space="preserve">Why Dijkstra is suitable for this graph</w:t>
       </w:r>
@@ -2866,7 +3068,7 @@
         <w:t xml:space="preserve"> </w:t>
       </w:r>
       <w:r>
-        <w:t xml:space="preserve">Dijkstra's correctness hinges on the</w:t>
+        <w:t xml:space="preserve">Dijkstra’s correctness hinges on the</w:t>
       </w:r>
       <w:r>
         <w:t xml:space="preserve"> </w:t>
@@ -2957,7 +3159,31 @@
         <w:t xml:space="preserve"> </w:t>
       </w:r>
       <w:r>
-        <w:t xml:space="preserve">is a "start → end" or "start → waypoint → … → end" query. Dijkstra</w:t>
+        <w:t xml:space="preserve">is a</w:t>
+      </w:r>
+      <w:r>
+        <w:t xml:space="preserve"> </w:t>
+      </w:r>
+      <w:r>
+        <w:t xml:space="preserve">“start → end”</w:t>
+      </w:r>
+      <w:r>
+        <w:t xml:space="preserve"> </w:t>
+      </w:r>
+      <w:r>
+        <w:t xml:space="preserve">or</w:t>
+      </w:r>
+      <w:r>
+        <w:t xml:space="preserve"> </w:t>
+      </w:r>
+      <w:r>
+        <w:t xml:space="preserve">“start → waypoint → … → end”</w:t>
+      </w:r>
+      <w:r>
+        <w:t xml:space="preserve"> </w:t>
+      </w:r>
+      <w:r>
+        <w:t xml:space="preserve">query. Dijkstra</w:t>
       </w:r>
       <w:r>
         <w:t xml:space="preserve"> </w:t>
@@ -3025,6 +3251,15 @@
         <w:pStyle w:val="Heading3"/>
       </w:pPr>
       <w:r>
+        <w:rPr>
+          <w:rStyle w:val="SectionNumber"/>
+        </w:rPr>
+        <w:t xml:space="preserve">2.3.2</w:t>
+      </w:r>
+      <w:r>
+        <w:tab/>
+      </w:r>
+      <w:r>
         <w:t xml:space="preserve">Implementation outline</w:t>
       </w:r>
     </w:p>
@@ -3265,6 +3500,15 @@
         <w:pStyle w:val="Heading3"/>
       </w:pPr>
       <w:r>
+        <w:rPr>
+          <w:rStyle w:val="SectionNumber"/>
+        </w:rPr>
+        <w:t xml:space="preserve">2.3.3</w:t>
+      </w:r>
+      <w:r>
+        <w:tab/>
+      </w:r>
+      <w:r>
         <w:t xml:space="preserve">Time and space complexity</w:t>
       </w:r>
     </w:p>
@@ -3349,6 +3593,15 @@
         <w:pStyle w:val="Heading3"/>
       </w:pPr>
       <w:r>
+        <w:rPr>
+          <w:rStyle w:val="SectionNumber"/>
+        </w:rPr>
+        <w:t xml:space="preserve">2.3.4</w:t>
+      </w:r>
+      <w:r>
+        <w:tab/>
+      </w:r>
+      <w:r>
         <w:t xml:space="preserve">Why this is faster than the textbook version</w:t>
       </w:r>
     </w:p>
@@ -3466,14 +3719,17 @@
         <w:t xml:space="preserve"> </w:t>
       </w:r>
       <w:r>
-        <w:t xml:space="preserve">explicitly during the session ("</w:t>
+        <w:t xml:space="preserve">explicitly during the session (</w:t>
+      </w:r>
+      <w:r>
+        <w:t xml:space="preserve">“</w:t>
       </w:r>
       <w:r>
         <w:rPr>
           <w:i/>
           <w:iCs/>
         </w:rPr>
-        <w:t xml:space="preserve">What if we don't use</w:t>
+        <w:t xml:space="preserve">What if we don’t use</w:t>
       </w:r>
       <w:r>
         <w:rPr>
@@ -3498,7 +3754,10 @@
         <w:t xml:space="preserve">? What if we use other data structures?</w:t>
       </w:r>
       <w:r>
-        <w:t xml:space="preserve">"), and</w:t>
+        <w:t xml:space="preserve">”</w:t>
+      </w:r>
+      <w:r>
+        <w:t xml:space="preserve">), and</w:t>
       </w:r>
       <w:r>
         <w:t xml:space="preserve"> </w:t>
@@ -3540,7 +3799,8 @@
     <w:tbl>
       <w:tblPr>
         <w:tblStyle w:val="Table"/>
-        <w:tblW w:type="auto" w:w="0"/>
+        <w:tblW w:type="pct" w:w="5000"/>
+        <w:tblLayout w:type="fixed"/>
         <w:tblLook w:firstRow="1" w:lastRow="0" w:firstColumn="0" w:lastColumn="0" w:noHBand="0" w:noVBand="0" w:val="0020"/>
       </w:tblPr>
       <w:tblGrid>
@@ -3606,7 +3866,10 @@
               <w:pStyle w:val="Compact"/>
             </w:pPr>
             <w:r>
-              <w:t xml:space="preserve">Membership test ("is</w:t>
+              <w:t xml:space="preserve">Membership test (</w:t>
+            </w:r>
+            <w:r>
+              <w:t xml:space="preserve">“is</w:t>
             </w:r>
             <w:r>
               <w:t xml:space="preserve"> </w:t>
@@ -3622,7 +3885,10 @@
               <w:t xml:space="preserve"> </w:t>
             </w:r>
             <w:r>
-              <w:t xml:space="preserve">already settled?")</w:t>
+              <w:t xml:space="preserve">already settled?”</w:t>
+            </w:r>
+            <w:r>
+              <w:t xml:space="preserve">)</w:t>
             </w:r>
           </w:p>
         </w:tc>
@@ -3696,7 +3962,10 @@
               <w:pStyle w:val="Compact"/>
             </w:pPr>
             <w:r>
-              <w:t xml:space="preserve">Extract-min ("cheapest unsettled</w:t>
+              <w:t xml:space="preserve">Extract-min (</w:t>
+            </w:r>
+            <w:r>
+              <w:t xml:space="preserve">“cheapest unsettled</w:t>
             </w:r>
             <w:r>
               <w:t xml:space="preserve"> </w:t>
@@ -3709,7 +3978,10 @@
               <w:t xml:space="preserve">v</w:t>
             </w:r>
             <w:r>
-              <w:t xml:space="preserve">?")</w:t>
+              <w:t xml:space="preserve">?”</w:t>
+            </w:r>
+            <w:r>
+              <w:t xml:space="preserve">)</w:t>
             </w:r>
           </w:p>
         </w:tc>
@@ -3958,6 +4230,15 @@
         <w:pStyle w:val="Heading4"/>
       </w:pPr>
       <w:r>
+        <w:rPr>
+          <w:rStyle w:val="SectionNumber"/>
+        </w:rPr>
+        <w:t xml:space="preserve">2.3.4.1</w:t>
+      </w:r>
+      <w:r>
+        <w:tab/>
+      </w:r>
+      <w:r>
         <w:t xml:space="preserve">Why the two swaps must be made together</w:t>
       </w:r>
     </w:p>
@@ -4118,7 +4399,7 @@
         <w:t xml:space="preserve">decreaseKey</w:t>
       </w:r>
       <w:r>
-        <w:t xml:space="preserve">, so when relaxation improves a node's</w:t>
+        <w:t xml:space="preserve">, so when relaxation improves a node’s</w:t>
       </w:r>
       <w:r>
         <w:t xml:space="preserve"> </w:t>
@@ -4230,11 +4511,20 @@
     <w:bookmarkEnd w:id="26"/>
     <w:bookmarkEnd w:id="27"/>
     <w:bookmarkEnd w:id="28"/>
-    <w:bookmarkStart w:id="31" w:name="X7f4fbef941973e5ce16fecebf6d070c6946746d"/>
+    <w:bookmarkStart w:id="31" w:name="local-vs-global-optimality"/>
     <w:p>
       <w:pPr>
         <w:pStyle w:val="Heading2"/>
       </w:pPr>
+      <w:r>
+        <w:rPr>
+          <w:rStyle w:val="SectionNumber"/>
+        </w:rPr>
+        <w:t xml:space="preserve">2.4</w:t>
+      </w:r>
+      <w:r>
+        <w:tab/>
+      </w:r>
       <w:r>
         <w:t xml:space="preserve">2.4 Local vs Global Optimality</w:t>
       </w:r>
@@ -4293,6 +4583,15 @@
       <w:pPr>
         <w:pStyle w:val="Heading3"/>
       </w:pPr>
+      <w:r>
+        <w:rPr>
+          <w:rStyle w:val="SectionNumber"/>
+        </w:rPr>
+        <w:t xml:space="preserve">2.4.1</w:t>
+      </w:r>
+      <w:r>
+        <w:tab/>
+      </w:r>
       <w:r>
         <w:t xml:space="preserve">Reason 1: Segment-wise stitching is not globally optimal</w:t>
       </w:r>
@@ -4615,13 +4914,25 @@
         <w:pStyle w:val="BodyText"/>
       </w:pPr>
       <w:r>
-        <w:t xml:space="preserve">The principled fix is to model "shortest path through a sequence of</w:t>
-      </w:r>
-      <w:r>
-        <w:t xml:space="preserve"> </w:t>
-      </w:r>
-      <w:r>
-        <w:t xml:space="preserve">required waypoints" as a single optimisation, not as a chain of</w:t>
+        <w:t xml:space="preserve">The principled fix is to model</w:t>
+      </w:r>
+      <w:r>
+        <w:t xml:space="preserve"> </w:t>
+      </w:r>
+      <w:r>
+        <w:t xml:space="preserve">“shortest path through a sequence of</w:t>
+      </w:r>
+      <w:r>
+        <w:t xml:space="preserve"> </w:t>
+      </w:r>
+      <w:r>
+        <w:t xml:space="preserve">required waypoints”</w:t>
+      </w:r>
+      <w:r>
+        <w:t xml:space="preserve"> </w:t>
+      </w:r>
+      <w:r>
+        <w:t xml:space="preserve">as a single optimisation, not as a chain of</w:t>
       </w:r>
       <w:r>
         <w:t xml:space="preserve"> </w:t>
@@ -4671,6 +4982,15 @@
         <w:pStyle w:val="Heading3"/>
       </w:pPr>
       <w:r>
+        <w:rPr>
+          <w:rStyle w:val="SectionNumber"/>
+        </w:rPr>
+        <w:t xml:space="preserve">2.4.2</w:t>
+      </w:r>
+      <w:r>
+        <w:tab/>
+      </w:r>
+      <w:r>
         <w:t xml:space="preserve">Reason 2: The inspection-planning problem is not just a sum of queries</w:t>
       </w:r>
     </w:p>
@@ -4714,11 +5034,20 @@
     </w:p>
     <w:bookmarkEnd w:id="30"/>
     <w:bookmarkEnd w:id="31"/>
-    <w:bookmarkStart w:id="35" w:name="X8ddb7028e9ed1cfb30c6613739df3280666aab5"/>
+    <w:bookmarkStart w:id="35" w:name="alternative-algorithms"/>
     <w:p>
       <w:pPr>
         <w:pStyle w:val="Heading2"/>
       </w:pPr>
+      <w:r>
+        <w:rPr>
+          <w:rStyle w:val="SectionNumber"/>
+        </w:rPr>
+        <w:t xml:space="preserve">2.5</w:t>
+      </w:r>
+      <w:r>
+        <w:tab/>
+      </w:r>
       <w:r>
         <w:t xml:space="preserve">2.5 Alternative Algorithms</w:t>
       </w:r>
@@ -4728,6 +5057,15 @@
       <w:pPr>
         <w:pStyle w:val="Heading3"/>
       </w:pPr>
+      <w:r>
+        <w:rPr>
+          <w:rStyle w:val="SectionNumber"/>
+        </w:rPr>
+        <w:t xml:space="preserve">2.5.1</w:t>
+      </w:r>
+      <w:r>
+        <w:tab/>
+      </w:r>
       <w:r>
         <w:t xml:space="preserve">If the graph were unweighted</w:t>
       </w:r>
@@ -4834,6 +5172,15 @@
         <w:pStyle w:val="Heading3"/>
       </w:pPr>
       <w:r>
+        <w:rPr>
+          <w:rStyle w:val="SectionNumber"/>
+        </w:rPr>
+        <w:t xml:space="preserve">2.5.2</w:t>
+      </w:r>
+      <w:r>
+        <w:tab/>
+      </w:r>
+      <w:r>
         <w:t xml:space="preserve">If the graph were much larger or had node coordinates</w:t>
       </w:r>
     </w:p>
@@ -4906,7 +5253,7 @@
         <w:t xml:space="preserve"> </w:t>
       </w:r>
       <w:r>
-        <w:t xml:space="preserve">(e.g. straight-line Euclidean distance when node coordinates are</w:t>
+        <w:t xml:space="preserve">(e.g. straight-line Euclidean distance when node coordinates are</w:t>
       </w:r>
       <w:r>
         <w:t xml:space="preserve"> </w:t>
@@ -5016,6 +5363,15 @@
       <w:pPr>
         <w:pStyle w:val="Heading3"/>
       </w:pPr>
+      <w:r>
+        <w:rPr>
+          <w:rStyle w:val="SectionNumber"/>
+        </w:rPr>
+        <w:t xml:space="preserve">2.5.3</w:t>
+      </w:r>
+      <w:r>
+        <w:tab/>
+      </w:r>
       <w:r>
         <w:t xml:space="preserve">Other candidates considered and rejected</w:t>
       </w:r>
@@ -5103,11 +5459,20 @@
     <w:bookmarkEnd w:id="34"/>
     <w:bookmarkEnd w:id="35"/>
     <w:bookmarkEnd w:id="36"/>
-    <w:bookmarkStart w:id="55" w:name="X3e9fdcadcb62319d05cfc79151604d7c4e68052"/>
+    <w:bookmarkStart w:id="55" w:name="Xcf2644a1e241debacdbc30f9c7d3f1076e6fb00"/>
     <w:p>
       <w:pPr>
         <w:pStyle w:val="Heading1"/>
       </w:pPr>
+      <w:r>
+        <w:rPr>
+          <w:rStyle w:val="SectionNumber"/>
+        </w:rPr>
+        <w:t xml:space="preserve">3</w:t>
+      </w:r>
+      <w:r>
+        <w:tab/>
+      </w:r>
       <w:r>
         <w:t xml:space="preserve">Chapter 3 — Design of the Overall Application (Task C)</w:t>
       </w:r>
@@ -5150,20 +5515,38 @@
         <w:t xml:space="preserve">(3) the OOP principles applied throughout.</w:t>
       </w:r>
     </w:p>
-    <w:bookmarkStart w:id="42" w:name="X55a042c927c0d5302c51096221e25c00accb6d7"/>
+    <w:bookmarkStart w:id="42" w:name="data-structures"/>
     <w:p>
       <w:pPr>
         <w:pStyle w:val="Heading2"/>
       </w:pPr>
       <w:r>
+        <w:rPr>
+          <w:rStyle w:val="SectionNumber"/>
+        </w:rPr>
+        <w:t xml:space="preserve">3.1</w:t>
+      </w:r>
+      <w:r>
+        <w:tab/>
+      </w:r>
+      <w:r>
         <w:t xml:space="preserve">3.1 Data Structures</w:t>
       </w:r>
     </w:p>
-    <w:bookmarkStart w:id="37" w:name="candidate-datasets--arraylistcandidate"/>
+    <w:bookmarkStart w:id="37" w:name="candidate-datasets-arraylistcandidate"/>
     <w:p>
       <w:pPr>
         <w:pStyle w:val="Heading3"/>
       </w:pPr>
+      <w:r>
+        <w:rPr>
+          <w:rStyle w:val="SectionNumber"/>
+        </w:rPr>
+        <w:t xml:space="preserve">3.1.1</w:t>
+      </w:r>
+      <w:r>
+        <w:tab/>
+      </w:r>
       <w:r>
         <w:t xml:space="preserve">Candidate datasets —</w:t>
       </w:r>
@@ -5613,11 +5996,20 @@
       </w:r>
     </w:p>
     <w:bookmarkEnd w:id="37"/>
-    <w:bookmarkStart w:id="39" w:name="X6168fa56344002bcebf5f11e4ac5adc35b40571"/>
+    <w:bookmarkStart w:id="39" w:name="X4abc3db07a1bbe77a64b70c3329da43aec780de"/>
     <w:p>
       <w:pPr>
         <w:pStyle w:val="Heading3"/>
       </w:pPr>
+      <w:r>
+        <w:rPr>
+          <w:rStyle w:val="SectionNumber"/>
+        </w:rPr>
+        <w:t xml:space="preserve">3.1.2</w:t>
+      </w:r>
+      <w:r>
+        <w:tab/>
+      </w:r>
       <w:r>
         <w:t xml:space="preserve">Weighted graph — adjacency list</w:t>
       </w:r>
@@ -5808,7 +6200,7 @@
         <w:t xml:space="preserve"> </w:t>
       </w:r>
       <w:r>
-        <w:t xml:space="preserve">iteration, which is exactly what Dijkstra's relaxation loop needs.</w:t>
+        <w:t xml:space="preserve">iteration, which is exactly what Dijkstra’s relaxation loop needs.</w:t>
       </w:r>
     </w:p>
     <w:p>
@@ -5879,7 +6271,7 @@
         <w:t xml:space="preserve"> </w:t>
       </w:r>
       <w:r>
-        <w:t xml:space="preserve">for each node's neighbour list</w:t>
+        <w:t xml:space="preserve">for each node’s neighbour list</w:t>
       </w:r>
       <w:r>
         <w:t xml:space="preserve"> </w:t>
@@ -5893,6 +6285,15 @@
       <w:pPr>
         <w:pStyle w:val="Heading4"/>
       </w:pPr>
+      <w:r>
+        <w:rPr>
+          <w:rStyle w:val="SectionNumber"/>
+        </w:rPr>
+        <w:t xml:space="preserve">3.1.2.1</w:t>
+      </w:r>
+      <w:r>
+        <w:tab/>
+      </w:r>
       <w:r>
         <w:t xml:space="preserve">Why a directed</w:t>
       </w:r>
@@ -6156,7 +6557,13 @@
         <w:t xml:space="preserve"> </w:t>
       </w:r>
       <w:r>
-        <w:t xml:space="preserve">stored once). But "give me the neighbours of node</w:t>
+        <w:t xml:space="preserve">stored once). But</w:t>
+      </w:r>
+      <w:r>
+        <w:t xml:space="preserve"> </w:t>
+      </w:r>
+      <w:r>
+        <w:t xml:space="preserve">“give me the neighbours of node</w:t>
       </w:r>
       <w:r>
         <w:t xml:space="preserve"> </w:t>
@@ -6168,7 +6575,13 @@
         <w:t xml:space="preserve">u</w:t>
       </w:r>
       <w:r>
-        <w:t xml:space="preserve">" requires a</w:t>
+        <w:t xml:space="preserve">”</w:t>
+      </w:r>
+      <w:r>
+        <w:t xml:space="preserve"> </w:t>
+      </w:r>
+      <w:r>
+        <w:t xml:space="preserve">requires a</w:t>
       </w:r>
       <w:r>
         <w:t xml:space="preserve"> </w:t>
@@ -6180,16 +6593,13 @@
         <w:t xml:space="preserve"> </w:t>
       </w:r>
       <w:r>
-        <w:t xml:space="preserve">row. Dijkstra's relaxation loop touches one node per pop and would</w:t>
-      </w:r>
-      <w:r>
-        <w:t xml:space="preserve"> </w:t>
-      </w:r>
-      <w:r>
-        <w:t xml:space="preserve">pay O(E) per pop, i.e.</w:t>
-      </w:r>
-      <w:r>
-        <w:t xml:space="preserve"> </w:t>
+        <w:t xml:space="preserve">row. Dijkstra’s relaxation loop touches one node per pop and would</w:t>
+      </w:r>
+      <w:r>
+        <w:t xml:space="preserve"> </w:t>
+      </w:r>
+      <w:r>
+        <w:t xml:space="preserve">pay O(E) per pop, i.e. </w:t>
       </w:r>
       <w:r>
         <w:rPr>
@@ -6285,7 +6695,7 @@
         <w:t xml:space="preserve"> </w:t>
       </w:r>
       <w:r>
-        <w:t xml:space="preserve">"</w:t>
+        <w:t xml:space="preserve">“</w:t>
       </w:r>
       <w:r>
         <w:rPr>
@@ -6298,13 +6708,16 @@
         <w:t xml:space="preserve"> </w:t>
       </w:r>
       <w:r>
-        <w:t xml:space="preserve">end of this edge is me?", a string comparison plus a</w:t>
-      </w:r>
-      <w:r>
-        <w:t xml:space="preserve"> </w:t>
-      </w:r>
-      <w:r>
-        <w:t xml:space="preserve">ternary. Subtle, but it sits inside Dijkstra's hottest inner loop.</w:t>
+        <w:t xml:space="preserve">end of this edge is me?”</w:t>
+      </w:r>
+      <w:r>
+        <w:t xml:space="preserve">, a string comparison plus a</w:t>
+      </w:r>
+      <w:r>
+        <w:t xml:space="preserve"> </w:t>
+      </w:r>
+      <w:r>
+        <w:t xml:space="preserve">ternary. Subtle, but it sits inside Dijkstra’s hottest inner loop.</w:t>
       </w:r>
     </w:p>
     <w:p>
@@ -6354,7 +6767,7 @@
         <w:t xml:space="preserve"> </w:t>
       </w:r>
       <w:r>
-        <w:t xml:space="preserve">Each edge is stored twice — once from each endpoint's point of</w:t>
+        <w:t xml:space="preserve">Each edge is stored twice — once from each endpoint’s point of</w:t>
       </w:r>
       <w:r>
         <w:t xml:space="preserve"> </w:t>
@@ -6449,7 +6862,7 @@
           <w:b/>
           <w:bCs/>
         </w:rPr>
-        <w:t xml:space="preserve">Dijkstra's inner loop, which executes thousands of times per query</w:t>
+        <w:t xml:space="preserve">Dijkstra’s inner loop, which executes thousands of times per query</w:t>
       </w:r>
       <w:r>
         <w:t xml:space="preserve">.</w:t>
@@ -6535,11 +6948,20 @@
     </w:p>
     <w:bookmarkEnd w:id="38"/>
     <w:bookmarkEnd w:id="39"/>
-    <w:bookmarkStart w:id="40" w:name="X363b3da63d5a8c7527075bff27bc8c7267933e6"/>
+    <w:bookmarkStart w:id="40" w:name="X7378f3daefe04a25aa191f227dea20b11dd8413"/>
     <w:p>
       <w:pPr>
         <w:pStyle w:val="Heading3"/>
       </w:pPr>
+      <w:r>
+        <w:rPr>
+          <w:rStyle w:val="SectionNumber"/>
+        </w:rPr>
+        <w:t xml:space="preserve">3.1.3</w:t>
+      </w:r>
+      <w:r>
+        <w:tab/>
+      </w:r>
       <w:r>
         <w:t xml:space="preserve">Priority queue — binary heap via</w:t>
       </w:r>
@@ -6558,7 +6980,7 @@
         <w:pStyle w:val="FirstParagraph"/>
       </w:pPr>
       <w:r>
-        <w:t xml:space="preserve">Dijkstra's open set is stored in a</w:t>
+        <w:t xml:space="preserve">Dijkstra’s open set is stored in a</w:t>
       </w:r>
       <w:r>
         <w:t xml:space="preserve"> </w:t>
@@ -6612,7 +7034,7 @@
         <w:t xml:space="preserve"> </w:t>
       </w:r>
       <w:r>
-        <w:t xml:space="preserve">library's</w:t>
+        <w:t xml:space="preserve">library’s</w:t>
       </w:r>
       <w:r>
         <w:t xml:space="preserve"> </w:t>
@@ -6639,7 +7061,7 @@
         <w:t xml:space="preserve"> </w:t>
       </w:r>
       <w:r>
-        <w:t xml:space="preserve">binary heap is the single change that drops Dijkstra's complexity from</w:t>
+        <w:t xml:space="preserve">binary heap is the single change that drops Dijkstra’s complexity from</w:t>
       </w:r>
       <w:r>
         <w:t xml:space="preserve"> </w:t>
@@ -6669,7 +7091,7 @@
         <w:t xml:space="preserve"> </w:t>
       </w:r>
       <w:r>
-        <w:t xml:space="preserve">pattern: when a node's distance improves we</w:t>
+        <w:t xml:space="preserve">pattern: when a node’s distance improves we</w:t>
       </w:r>
       <w:r>
         <w:t xml:space="preserve"> </w:t>
@@ -6709,11 +7131,20 @@
       </w:r>
     </w:p>
     <w:bookmarkEnd w:id="40"/>
-    <w:bookmarkStart w:id="41" w:name="result-types--immutable-records"/>
+    <w:bookmarkStart w:id="41" w:name="result-types-immutable-records"/>
     <w:p>
       <w:pPr>
         <w:pStyle w:val="Heading3"/>
       </w:pPr>
+      <w:r>
+        <w:rPr>
+          <w:rStyle w:val="SectionNumber"/>
+        </w:rPr>
+        <w:t xml:space="preserve">3.1.4</w:t>
+      </w:r>
+      <w:r>
+        <w:tab/>
+      </w:r>
       <w:r>
         <w:t xml:space="preserve">Result types — immutable records</w:t>
       </w:r>
@@ -6823,11 +7254,20 @@
     </w:p>
     <w:bookmarkEnd w:id="41"/>
     <w:bookmarkEnd w:id="42"/>
-    <w:bookmarkStart w:id="48" w:name="X73947c9536d0406fb80ec8db700120f22412cfd"/>
+    <w:bookmarkStart w:id="48" w:name="classes-and-responsibilities"/>
     <w:p>
       <w:pPr>
         <w:pStyle w:val="Heading2"/>
       </w:pPr>
+      <w:r>
+        <w:rPr>
+          <w:rStyle w:val="SectionNumber"/>
+        </w:rPr>
+        <w:t xml:space="preserve">3.2</w:t>
+      </w:r>
+      <w:r>
+        <w:tab/>
+      </w:r>
       <w:r>
         <w:t xml:space="preserve">3.2 Classes and Responsibilities</w:t>
       </w:r>
@@ -6933,7 +7373,7 @@
         <w:t xml:space="preserve">PriorityQueue</w:t>
       </w:r>
       <w:r>
-        <w:t xml:space="preserve">) sit in Java's</w:t>
+        <w:t xml:space="preserve">) sit in Java’s</w:t>
       </w:r>
       <w:r>
         <w:t xml:space="preserve"> </w:t>
@@ -6942,11 +7382,20 @@
         <w:t xml:space="preserve">Collection / Map hierarchy.</w:t>
       </w:r>
     </w:p>
-    <w:bookmarkStart w:id="43" w:name="layer-1--immutable-data-carriers"/>
+    <w:bookmarkStart w:id="43" w:name="layer-1-immutable-data-carriers"/>
     <w:p>
       <w:pPr>
         <w:pStyle w:val="Heading3"/>
       </w:pPr>
+      <w:r>
+        <w:rPr>
+          <w:rStyle w:val="SectionNumber"/>
+        </w:rPr>
+        <w:t xml:space="preserve">3.2.1</w:t>
+      </w:r>
+      <w:r>
+        <w:tab/>
+      </w:r>
       <w:r>
         <w:t xml:space="preserve">Layer 1 — immutable data carriers</w:t>
       </w:r>
@@ -6962,7 +7411,8 @@
     <w:tbl>
       <w:tblPr>
         <w:tblStyle w:val="Table"/>
-        <w:tblW w:type="auto" w:w="0"/>
+        <w:tblW w:type="pct" w:w="5000"/>
+        <w:tblLayout w:type="fixed"/>
         <w:tblLook w:firstRow="1" w:lastRow="0" w:firstColumn="0" w:lastColumn="0" w:noHBand="0" w:noVBand="0" w:val="0020"/>
       </w:tblPr>
       <w:tblGrid>
@@ -7207,19 +7657,29 @@
       </w:r>
     </w:p>
     <w:bookmarkEnd w:id="43"/>
-    <w:bookmarkStart w:id="44" w:name="layer-2--service--utility"/>
+    <w:bookmarkStart w:id="44" w:name="layer-2-service-utility"/>
     <w:p>
       <w:pPr>
         <w:pStyle w:val="Heading3"/>
       </w:pPr>
       <w:r>
+        <w:rPr>
+          <w:rStyle w:val="SectionNumber"/>
+        </w:rPr>
+        <w:t xml:space="preserve">3.2.2</w:t>
+      </w:r>
+      <w:r>
+        <w:tab/>
+      </w:r>
+      <w:r>
         <w:t xml:space="preserve">Layer 2 — service / utility</w:t>
       </w:r>
     </w:p>
     <w:tbl>
       <w:tblPr>
         <w:tblStyle w:val="Table"/>
-        <w:tblW w:type="auto" w:w="0"/>
+        <w:tblW w:type="pct" w:w="5000"/>
+        <w:tblLayout w:type="fixed"/>
         <w:tblLook w:firstRow="1" w:lastRow="0" w:firstColumn="0" w:lastColumn="0" w:noHBand="0" w:noVBand="0" w:val="0020"/>
       </w:tblPr>
       <w:tblGrid>
@@ -7505,19 +7965,29 @@
       </w:tr>
     </w:tbl>
     <w:bookmarkEnd w:id="44"/>
-    <w:bookmarkStart w:id="45" w:name="X713ca2c7717b6eb0174163555e38a28a10203d8"/>
+    <w:bookmarkStart w:id="45" w:name="X35d6da27cb6f0d0cb6f814147c9671614352a09"/>
     <w:p>
       <w:pPr>
         <w:pStyle w:val="Heading3"/>
       </w:pPr>
       <w:r>
+        <w:rPr>
+          <w:rStyle w:val="SectionNumber"/>
+        </w:rPr>
+        <w:t xml:space="preserve">3.2.3</w:t>
+      </w:r>
+      <w:r>
+        <w:tab/>
+      </w:r>
+      <w:r>
         <w:t xml:space="preserve">Layer 3 — algorithm abstractions and implementations</w:t>
       </w:r>
     </w:p>
     <w:tbl>
       <w:tblPr>
         <w:tblStyle w:val="Table"/>
-        <w:tblW w:type="auto" w:w="0"/>
+        <w:tblW w:type="pct" w:w="5000"/>
+        <w:tblLayout w:type="fixed"/>
         <w:tblLook w:firstRow="1" w:lastRow="0" w:firstColumn="0" w:lastColumn="0" w:noHBand="0" w:noVBand="0" w:val="0020"/>
       </w:tblPr>
       <w:tblGrid>
@@ -7802,19 +8272,29 @@
       </w:tr>
     </w:tbl>
     <w:bookmarkEnd w:id="45"/>
-    <w:bookmarkStart w:id="46" w:name="layer-4--driver"/>
+    <w:bookmarkStart w:id="46" w:name="layer-4-driver"/>
     <w:p>
       <w:pPr>
         <w:pStyle w:val="Heading3"/>
       </w:pPr>
       <w:r>
+        <w:rPr>
+          <w:rStyle w:val="SectionNumber"/>
+        </w:rPr>
+        <w:t xml:space="preserve">3.2.4</w:t>
+      </w:r>
+      <w:r>
+        <w:tab/>
+      </w:r>
+      <w:r>
         <w:t xml:space="preserve">Layer 4 — driver</w:t>
       </w:r>
     </w:p>
     <w:tbl>
       <w:tblPr>
         <w:tblStyle w:val="Table"/>
-        <w:tblW w:type="auto" w:w="0"/>
+        <w:tblW w:type="pct" w:w="5000"/>
+        <w:tblLayout w:type="fixed"/>
         <w:tblLook w:firstRow="1" w:lastRow="0" w:firstColumn="0" w:lastColumn="0" w:noHBand="0" w:noVBand="0" w:val="0020"/>
       </w:tblPr>
       <w:tblGrid>
@@ -7928,6 +8408,15 @@
         <w:pStyle w:val="Heading3"/>
       </w:pPr>
       <w:r>
+        <w:rPr>
+          <w:rStyle w:val="SectionNumber"/>
+        </w:rPr>
+        <w:t xml:space="preserve">3.2.5</w:t>
+      </w:r>
+      <w:r>
+        <w:tab/>
+      </w:r>
+      <w:r>
         <w:t xml:space="preserve">How the classes collaborate</w:t>
       </w:r>
     </w:p>
@@ -8292,7 +8781,7 @@
         <w:t xml:space="preserve">Main</w:t>
       </w:r>
       <w:r>
-        <w:t xml:space="preserve">'s</w:t>
+        <w:t xml:space="preserve">’s</w:t>
       </w:r>
       <w:r>
         <w:t xml:space="preserve"> </w:t>
@@ -8303,11 +8792,20 @@
     </w:p>
     <w:bookmarkEnd w:id="47"/>
     <w:bookmarkEnd w:id="48"/>
-    <w:bookmarkStart w:id="54" w:name="X26f2699942ab2e29fe5c26b8741f61c525cb65c"/>
+    <w:bookmarkStart w:id="54" w:name="object-oriented-principles"/>
     <w:p>
       <w:pPr>
         <w:pStyle w:val="Heading2"/>
       </w:pPr>
+      <w:r>
+        <w:rPr>
+          <w:rStyle w:val="SectionNumber"/>
+        </w:rPr>
+        <w:t xml:space="preserve">3.3</w:t>
+      </w:r>
+      <w:r>
+        <w:tab/>
+      </w:r>
       <w:r>
         <w:t xml:space="preserve">3.3 Object-Oriented Principles</w:t>
       </w:r>
@@ -8337,6 +8835,15 @@
       <w:pPr>
         <w:pStyle w:val="Heading3"/>
       </w:pPr>
+      <w:r>
+        <w:rPr>
+          <w:rStyle w:val="SectionNumber"/>
+        </w:rPr>
+        <w:t xml:space="preserve">3.3.1</w:t>
+      </w:r>
+      <w:r>
+        <w:tab/>
+      </w:r>
       <w:r>
         <w:t xml:space="preserve">Encapsulation</w:t>
       </w:r>
@@ -9045,6 +9552,15 @@
         <w:pStyle w:val="Heading3"/>
       </w:pPr>
       <w:r>
+        <w:rPr>
+          <w:rStyle w:val="SectionNumber"/>
+        </w:rPr>
+        <w:t xml:space="preserve">3.3.2</w:t>
+      </w:r>
+      <w:r>
+        <w:tab/>
+      </w:r>
+      <w:r>
         <w:t xml:space="preserve">Inheritance</w:t>
       </w:r>
     </w:p>
@@ -9173,7 +9689,7 @@
         <w:t xml:space="preserve"> </w:t>
       </w:r>
       <w:r>
-        <w:t xml:space="preserve">(e.g. our</w:t>
+        <w:t xml:space="preserve">(e.g. our</w:t>
       </w:r>
       <w:r>
         <w:t xml:space="preserve"> </w:t>
@@ -9375,6 +9891,15 @@
       <w:pPr>
         <w:pStyle w:val="Heading3"/>
       </w:pPr>
+      <w:r>
+        <w:rPr>
+          <w:rStyle w:val="SectionNumber"/>
+        </w:rPr>
+        <w:t xml:space="preserve">3.3.3</w:t>
+      </w:r>
+      <w:r>
+        <w:tab/>
+      </w:r>
       <w:r>
         <w:t xml:space="preserve">Abstraction</w:t>
       </w:r>
@@ -9405,13 +9930,22 @@
         <w:t xml:space="preserve"> </w:t>
       </w:r>
       <w:r>
-        <w:t xml:space="preserve">abstracts "an algorithm that sorts a list given a</w:t>
-      </w:r>
-      <w:r>
-        <w:t xml:space="preserve"> </w:t>
-      </w:r>
-      <w:r>
-        <w:t xml:space="preserve">comparator". The benchmark and</w:t>
+        <w:t xml:space="preserve">abstracts</w:t>
+      </w:r>
+      <w:r>
+        <w:t xml:space="preserve"> </w:t>
+      </w:r>
+      <w:r>
+        <w:t xml:space="preserve">“an algorithm that sorts a list given a</w:t>
+      </w:r>
+      <w:r>
+        <w:t xml:space="preserve"> </w:t>
+      </w:r>
+      <w:r>
+        <w:t xml:space="preserve">comparator”</w:t>
+      </w:r>
+      <w:r>
+        <w:t xml:space="preserve">. The benchmark and</w:t>
       </w:r>
       <w:r>
         <w:t xml:space="preserve"> </w:t>
@@ -9453,13 +9987,22 @@
         <w:t xml:space="preserve"> </w:t>
       </w:r>
       <w:r>
-        <w:t xml:space="preserve">abstracts "an algorithm that finds the shortest</w:t>
-      </w:r>
-      <w:r>
-        <w:t xml:space="preserve"> </w:t>
-      </w:r>
-      <w:r>
-        <w:t xml:space="preserve">path on a weighted graph". The driver knows nothing of whether the</w:t>
+        <w:t xml:space="preserve">abstracts</w:t>
+      </w:r>
+      <w:r>
+        <w:t xml:space="preserve"> </w:t>
+      </w:r>
+      <w:r>
+        <w:t xml:space="preserve">“an algorithm that finds the shortest</w:t>
+      </w:r>
+      <w:r>
+        <w:t xml:space="preserve"> </w:t>
+      </w:r>
+      <w:r>
+        <w:t xml:space="preserve">path on a weighted graph”</w:t>
+      </w:r>
+      <w:r>
+        <w:t xml:space="preserve">. The driver knows nothing of whether the</w:t>
       </w:r>
       <w:r>
         <w:t xml:space="preserve"> </w:t>
@@ -9528,6 +10071,15 @@
         <w:pStyle w:val="Heading3"/>
       </w:pPr>
       <w:r>
+        <w:rPr>
+          <w:rStyle w:val="SectionNumber"/>
+        </w:rPr>
+        <w:t xml:space="preserve">3.3.4</w:t>
+      </w:r>
+      <w:r>
+        <w:tab/>
+      </w:r>
+      <w:r>
         <w:t xml:space="preserve">Polymorphism</w:t>
       </w:r>
     </w:p>
@@ -10234,6 +10786,15 @@
       <w:pPr>
         <w:pStyle w:val="Heading3"/>
       </w:pPr>
+      <w:r>
+        <w:rPr>
+          <w:rStyle w:val="SectionNumber"/>
+        </w:rPr>
+        <w:t xml:space="preserve">3.3.5</w:t>
+      </w:r>
+      <w:r>
+        <w:tab/>
+      </w:r>
       <w:r>
         <w:t xml:space="preserve">Why these principles matter to this project</w:t>
       </w:r>
@@ -10334,7 +10895,16 @@
         <w:t xml:space="preserve"> </w:t>
       </w:r>
       <w:r>
-        <w:t xml:space="preserve">maps to a specific code site, not to a vague "OO style".</w:t>
+        <w:t xml:space="preserve">maps to a specific code site, not to a vague</w:t>
+      </w:r>
+      <w:r>
+        <w:t xml:space="preserve"> </w:t>
+      </w:r>
+      <w:r>
+        <w:t xml:space="preserve">“OO style”</w:t>
+      </w:r>
+      <w:r>
+        <w:t xml:space="preserve">.</w:t>
       </w:r>
     </w:p>
     <w:p>
@@ -10416,20 +10986,38 @@
     <w:bookmarkEnd w:id="53"/>
     <w:bookmarkEnd w:id="54"/>
     <w:bookmarkEnd w:id="55"/>
-    <w:bookmarkStart w:id="70" w:name="chapter-4--project-reflection-task-d"/>
+    <w:bookmarkStart w:id="70" w:name="chapter-4-project-reflection-task-d"/>
     <w:p>
       <w:pPr>
         <w:pStyle w:val="Heading1"/>
       </w:pPr>
       <w:r>
+        <w:rPr>
+          <w:rStyle w:val="SectionNumber"/>
+        </w:rPr>
+        <w:t xml:space="preserve">4</w:t>
+      </w:r>
+      <w:r>
+        <w:tab/>
+      </w:r>
+      <w:r>
         <w:t xml:space="preserve">Chapter 4 — Project Reflection (Task D)</w:t>
       </w:r>
     </w:p>
-    <w:bookmarkStart w:id="60" w:name="X632d2c800168200a9a720839add9a3fa5aee90a"/>
+    <w:bookmarkStart w:id="60" w:name="ai-assisted-planning-and-collaboration"/>
     <w:p>
       <w:pPr>
         <w:pStyle w:val="Heading2"/>
       </w:pPr>
+      <w:r>
+        <w:rPr>
+          <w:rStyle w:val="SectionNumber"/>
+        </w:rPr>
+        <w:t xml:space="preserve">4.1</w:t>
+      </w:r>
+      <w:r>
+        <w:tab/>
+      </w:r>
       <w:r>
         <w:t xml:space="preserve">4.1 AI-Assisted Planning and Collaboration</w:t>
       </w:r>
@@ -10467,7 +11055,7 @@
         <w:t xml:space="preserve"> </w:t>
       </w:r>
       <w:r>
-        <w:t xml:space="preserve">family that the module's session slides explicitly named (Jira / Trello)</w:t>
+        <w:t xml:space="preserve">family that the module’s session slides explicitly named (Jira / Trello)</w:t>
       </w:r>
       <w:r>
         <w:t xml:space="preserve"> </w:t>
@@ -10485,7 +11073,13 @@
         <w:t xml:space="preserve"> </w:t>
       </w:r>
       <w:r>
-        <w:t xml:space="preserve">"AI-assisted Software Management tool" requirement.</w:t>
+        <w:t xml:space="preserve">“AI-assisted Software Management tool”</w:t>
+      </w:r>
+      <w:r>
+        <w:t xml:space="preserve"> </w:t>
+      </w:r>
+      <w:r>
+        <w:t xml:space="preserve">requirement.</w:t>
       </w:r>
     </w:p>
     <w:bookmarkStart w:id="56" w:name="how-we-used-it"/>
@@ -10493,6 +11087,15 @@
       <w:pPr>
         <w:pStyle w:val="Heading3"/>
       </w:pPr>
+      <w:r>
+        <w:rPr>
+          <w:rStyle w:val="SectionNumber"/>
+        </w:rPr>
+        <w:t xml:space="preserve">4.1.1</w:t>
+      </w:r>
+      <w:r>
+        <w:tab/>
+      </w:r>
       <w:r>
         <w:t xml:space="preserve">How we used it</w:t>
       </w:r>
@@ -10776,6 +11379,15 @@
         <w:pStyle w:val="Heading3"/>
       </w:pPr>
       <w:r>
+        <w:rPr>
+          <w:rStyle w:val="SectionNumber"/>
+        </w:rPr>
+        <w:t xml:space="preserve">4.1.2</w:t>
+      </w:r>
+      <w:r>
+        <w:tab/>
+      </w:r>
+      <w:r>
         <w:t xml:space="preserve">Why we planned the project this way</w:t>
       </w:r>
     </w:p>
@@ -10824,7 +11436,7 @@
         <w:t xml:space="preserve"> </w:t>
       </w:r>
       <w:r>
-        <w:t xml:space="preserve">reading (task sheet, session slides, teammate's draft) rather than</w:t>
+        <w:t xml:space="preserve">reading (task sheet, session slides, teammate’s draft) rather than</w:t>
       </w:r>
       <w:r>
         <w:t xml:space="preserve"> </w:t>
@@ -10864,13 +11476,13 @@
         <w:t xml:space="preserve"> </w:t>
       </w:r>
       <w:r>
-        <w:t xml:space="preserve">Task A's analysis depends</w:t>
-      </w:r>
-      <w:r>
-        <w:t xml:space="preserve"> </w:t>
-      </w:r>
-      <w:r>
-        <w:t xml:space="preserve">on running benchmarks; Task B's analysis depends on running the</w:t>
+        <w:t xml:space="preserve">Task A’s analysis depends</w:t>
+      </w:r>
+      <w:r>
+        <w:t xml:space="preserve"> </w:t>
+      </w:r>
+      <w:r>
+        <w:t xml:space="preserve">on running benchmarks; Task B’s analysis depends on running the</w:t>
       </w:r>
       <w:r>
         <w:t xml:space="preserve"> </w:t>
@@ -10882,13 +11494,37 @@
         <w:t xml:space="preserve"> </w:t>
       </w:r>
       <w:r>
-        <w:t xml:space="preserve">re-running code while drafting prose. We therefore put "stabilise</w:t>
-      </w:r>
-      <w:r>
-        <w:t xml:space="preserve"> </w:t>
-      </w:r>
-      <w:r>
-        <w:t xml:space="preserve">benchmark methodology" and "verify Task B output" as the earliest</w:t>
+        <w:t xml:space="preserve">re-running code while drafting prose. We therefore put</w:t>
+      </w:r>
+      <w:r>
+        <w:t xml:space="preserve"> </w:t>
+      </w:r>
+      <w:r>
+        <w:t xml:space="preserve">“stabilise</w:t>
+      </w:r>
+      <w:r>
+        <w:t xml:space="preserve"> </w:t>
+      </w:r>
+      <w:r>
+        <w:t xml:space="preserve">benchmark methodology”</w:t>
+      </w:r>
+      <w:r>
+        <w:t xml:space="preserve"> </w:t>
+      </w:r>
+      <w:r>
+        <w:t xml:space="preserve">and</w:t>
+      </w:r>
+      <w:r>
+        <w:t xml:space="preserve"> </w:t>
+      </w:r>
+      <w:r>
+        <w:t xml:space="preserve">“verify Task B output”</w:t>
+      </w:r>
+      <w:r>
+        <w:t xml:space="preserve"> </w:t>
+      </w:r>
+      <w:r>
+        <w:t xml:space="preserve">as the earliest</w:t>
       </w:r>
       <w:r>
         <w:t xml:space="preserve"> </w:t>
@@ -10934,7 +11570,7 @@
         <w:t xml:space="preserve"> </w:t>
       </w:r>
       <w:r>
-        <w:t xml:space="preserve">whoever wakes up first sees what's blocked, what's in progress, and</w:t>
+        <w:t xml:space="preserve">whoever wakes up first sees what’s blocked, what’s in progress, and</w:t>
       </w:r>
       <w:r>
         <w:t xml:space="preserve"> </w:t>
@@ -10955,6 +11591,15 @@
       <w:pPr>
         <w:pStyle w:val="Heading3"/>
       </w:pPr>
+      <w:r>
+        <w:rPr>
+          <w:rStyle w:val="SectionNumber"/>
+        </w:rPr>
+        <w:t xml:space="preserve">4.1.3</w:t>
+      </w:r>
+      <w:r>
+        <w:tab/>
+      </w:r>
       <w:r>
         <w:t xml:space="preserve">Advantages of AI-assisted task management</w:t>
       </w:r>
@@ -11040,19 +11685,34 @@
         <w:t xml:space="preserve"> </w:t>
       </w:r>
       <w:r>
-        <w:t xml:space="preserve">emails the assignee 24 hours before a card's due date. This shifts</w:t>
-      </w:r>
-      <w:r>
-        <w:t xml:space="preserve"> </w:t>
-      </w:r>
-      <w:r>
-        <w:t xml:space="preserve">accountability from "did your teammate remember to remind you?" to</w:t>
-      </w:r>
-      <w:r>
-        <w:t xml:space="preserve"> </w:t>
-      </w:r>
-      <w:r>
-        <w:t xml:space="preserve">"did the system remind you?".</w:t>
+        <w:t xml:space="preserve">emails the assignee 24 hours before a card’s due date. This shifts</w:t>
+      </w:r>
+      <w:r>
+        <w:t xml:space="preserve"> </w:t>
+      </w:r>
+      <w:r>
+        <w:t xml:space="preserve">accountability from</w:t>
+      </w:r>
+      <w:r>
+        <w:t xml:space="preserve"> </w:t>
+      </w:r>
+      <w:r>
+        <w:t xml:space="preserve">“did your teammate remember to remind you?”</w:t>
+      </w:r>
+      <w:r>
+        <w:t xml:space="preserve"> </w:t>
+      </w:r>
+      <w:r>
+        <w:t xml:space="preserve">to</w:t>
+      </w:r>
+      <w:r>
+        <w:t xml:space="preserve"> </w:t>
+      </w:r>
+      <w:r>
+        <w:t xml:space="preserve">“did the system remind you?”</w:t>
+      </w:r>
+      <w:r>
+        <w:t xml:space="preserve">.</w:t>
       </w:r>
     </w:p>
     <w:p>
@@ -11092,7 +11752,7 @@
         <w:t xml:space="preserve"> </w:t>
       </w:r>
       <w:r>
-        <w:t xml:space="preserve">over the project's lifetime.</w:t>
+        <w:t xml:space="preserve">over the project’s lifetime.</w:t>
       </w:r>
     </w:p>
     <w:bookmarkEnd w:id="58"/>
@@ -11101,6 +11761,15 @@
       <w:pPr>
         <w:pStyle w:val="Heading3"/>
       </w:pPr>
+      <w:r>
+        <w:rPr>
+          <w:rStyle w:val="SectionNumber"/>
+        </w:rPr>
+        <w:t xml:space="preserve">4.1.4</w:t>
+      </w:r>
+      <w:r>
+        <w:tab/>
+      </w:r>
       <w:r>
         <w:t xml:space="preserve">Disadvantages we observed</w:t>
       </w:r>
@@ -11130,13 +11799,19 @@
         <w:t xml:space="preserve"> </w:t>
       </w:r>
       <w:r>
-        <w:t xml:space="preserve">Trello's automation suggest sub-tasks for a card that was already</w:t>
-      </w:r>
-      <w:r>
-        <w:t xml:space="preserve"> </w:t>
-      </w:r>
-      <w:r>
-        <w:t xml:space="preserve">small (e.g. "format final report"), it produced four trivial</w:t>
+        <w:t xml:space="preserve">Trello’s automation suggest sub-tasks for a card that was already</w:t>
+      </w:r>
+      <w:r>
+        <w:t xml:space="preserve"> </w:t>
+      </w:r>
+      <w:r>
+        <w:t xml:space="preserve">small (e.g. </w:t>
+      </w:r>
+      <w:r>
+        <w:t xml:space="preserve">“format final report”</w:t>
+      </w:r>
+      <w:r>
+        <w:t xml:space="preserve">), it produced four trivial</w:t>
       </w:r>
       <w:r>
         <w:t xml:space="preserve"> </w:t>
@@ -11282,7 +11957,13 @@
         <w:t xml:space="preserve"> </w:t>
       </w:r>
       <w:r>
-        <w:t xml:space="preserve">"hallucination" failure mode, and the right mitigation is the same one</w:t>
+        <w:t xml:space="preserve">“hallucination”</w:t>
+      </w:r>
+      <w:r>
+        <w:t xml:space="preserve"> </w:t>
+      </w:r>
+      <w:r>
+        <w:t xml:space="preserve">failure mode, and the right mitigation is the same one</w:t>
       </w:r>
       <w:r>
         <w:t xml:space="preserve"> </w:t>
@@ -11294,7 +11975,7 @@
         <w:t xml:space="preserve"> </w:t>
       </w:r>
       <w:r>
-        <w:t xml:space="preserve">authoritative source (Liang's textbook, the task sheet) before</w:t>
+        <w:t xml:space="preserve">authoritative source (Liang’s textbook, the task sheet) before</w:t>
       </w:r>
       <w:r>
         <w:t xml:space="preserve"> </w:t>
@@ -11305,11 +11986,20 @@
     </w:p>
     <w:bookmarkEnd w:id="59"/>
     <w:bookmarkEnd w:id="60"/>
-    <w:bookmarkStart w:id="65" w:name="X5d4c662a58c21f218b97d44902664d13485a17c"/>
+    <w:bookmarkStart w:id="65" w:name="equality-diversity-and-inclusion"/>
     <w:p>
       <w:pPr>
         <w:pStyle w:val="Heading2"/>
       </w:pPr>
+      <w:r>
+        <w:rPr>
+          <w:rStyle w:val="SectionNumber"/>
+        </w:rPr>
+        <w:t xml:space="preserve">4.2</w:t>
+      </w:r>
+      <w:r>
+        <w:tab/>
+      </w:r>
       <w:r>
         <w:t xml:space="preserve">4.2 Equality, Diversity, and Inclusion</w:t>
       </w:r>
@@ -11320,6 +12010,15 @@
         <w:pStyle w:val="Heading3"/>
       </w:pPr>
       <w:r>
+        <w:rPr>
+          <w:rStyle w:val="SectionNumber"/>
+        </w:rPr>
+        <w:t xml:space="preserve">4.2.1</w:t>
+      </w:r>
+      <w:r>
+        <w:tab/>
+      </w:r>
+      <w:r>
         <w:t xml:space="preserve">Why EDI matters in software design</w:t>
       </w:r>
     </w:p>
@@ -11364,7 +12063,19 @@
         <w:t xml:space="preserve"> </w:t>
       </w:r>
       <w:r>
-        <w:t xml:space="preserve">conditions. Designing for an "average" user implicitly excludes</w:t>
+        <w:t xml:space="preserve">conditions. Designing for an</w:t>
+      </w:r>
+      <w:r>
+        <w:t xml:space="preserve"> </w:t>
+      </w:r>
+      <w:r>
+        <w:t xml:space="preserve">“average”</w:t>
+      </w:r>
+      <w:r>
+        <w:t xml:space="preserve"> </w:t>
+      </w:r>
+      <w:r>
+        <w:t xml:space="preserve">user implicitly excludes</w:t>
       </w:r>
       <w:r>
         <w:t xml:space="preserve"> </w:t>
@@ -11391,6 +12102,15 @@
       <w:pPr>
         <w:pStyle w:val="Heading3"/>
       </w:pPr>
+      <w:r>
+        <w:rPr>
+          <w:rStyle w:val="SectionNumber"/>
+        </w:rPr>
+        <w:t xml:space="preserve">4.2.2</w:t>
+      </w:r>
+      <w:r>
+        <w:tab/>
+      </w:r>
       <w:r>
         <w:t xml:space="preserve">Where the current system would exclude users</w:t>
       </w:r>
@@ -11440,7 +12160,13 @@
         <w:t xml:space="preserve"> </w:t>
       </w:r>
       <w:r>
-        <w:t xml:space="preserve">("L0001 -&gt; L0340 -&gt; ...") is not optimised for speech: a</w:t>
+        <w:t xml:space="preserve">(</w:t>
+      </w:r>
+      <w:r>
+        <w:t xml:space="preserve">“L0001 -&gt; L0340 -&gt; …”</w:t>
+      </w:r>
+      <w:r>
+        <w:t xml:space="preserve">) is not optimised for speech: a</w:t>
       </w:r>
       <w:r>
         <w:t xml:space="preserve"> </w:t>
@@ -11551,6 +12277,15 @@
         <w:pStyle w:val="Heading3"/>
       </w:pPr>
       <w:r>
+        <w:rPr>
+          <w:rStyle w:val="SectionNumber"/>
+        </w:rPr>
+        <w:t xml:space="preserve">4.2.3</w:t>
+      </w:r>
+      <w:r>
+        <w:tab/>
+      </w:r>
+      <w:r>
         <w:t xml:space="preserve">Concrete improvements (with implementation sketches)</w:t>
       </w:r>
     </w:p>
@@ -11573,7 +12308,7 @@
         <w:t xml:space="preserve"> </w:t>
       </w:r>
       <w:r>
-        <w:t xml:space="preserve">for visually impaired users. Java's</w:t>
+        <w:t xml:space="preserve">for visually impaired users. Java’s</w:t>
       </w:r>
       <w:r>
         <w:t xml:space="preserve"> </w:t>
@@ -11594,7 +12329,7 @@
         <w:t xml:space="preserve"> </w:t>
       </w:r>
       <w:r>
-        <w:t xml:space="preserve">(e.g. FreeTTS, MaryTTS) can synthesise a sentence-level summary of</w:t>
+        <w:t xml:space="preserve">(e.g. FreeTTS, MaryTTS) can synthesise a sentence-level summary of</w:t>
       </w:r>
       <w:r>
         <w:t xml:space="preserve"> </w:t>
@@ -11612,13 +12347,25 @@
         <w:t xml:space="preserve">PathResult</w:t>
       </w:r>
       <w:r>
-        <w:t xml:space="preserve">: "Travel from location 1 to location 10 via 6 stops,</w:t>
-      </w:r>
-      <w:r>
-        <w:t xml:space="preserve"> </w:t>
-      </w:r>
-      <w:r>
-        <w:t xml:space="preserve">total distance 27 units." This requires extending</w:t>
+        <w:t xml:space="preserve">:</w:t>
+      </w:r>
+      <w:r>
+        <w:t xml:space="preserve"> </w:t>
+      </w:r>
+      <w:r>
+        <w:t xml:space="preserve">“Travel from location 1 to location 10 via 6 stops,</w:t>
+      </w:r>
+      <w:r>
+        <w:t xml:space="preserve"> </w:t>
+      </w:r>
+      <w:r>
+        <w:t xml:space="preserve">total distance 27 units.”</w:t>
+      </w:r>
+      <w:r>
+        <w:t xml:space="preserve"> </w:t>
+      </w:r>
+      <w:r>
+        <w:t xml:space="preserve">This requires extending</w:t>
       </w:r>
       <w:r>
         <w:t xml:space="preserve"> </w:t>
@@ -11694,7 +12441,7 @@
         <w:t xml:space="preserve"> </w:t>
       </w:r>
       <w:r>
-        <w:t xml:space="preserve">Java's</w:t>
+        <w:t xml:space="preserve">Java’s</w:t>
       </w:r>
       <w:r>
         <w:t xml:space="preserve"> </w:t>
@@ -11730,7 +12477,7 @@
         <w:t xml:space="preserve"> </w:t>
       </w:r>
       <w:r>
-        <w:t xml:space="preserve">configuration change. The project's data layer (location ids, edge</w:t>
+        <w:t xml:space="preserve">configuration change. The project’s data layer (location ids, edge</w:t>
       </w:r>
       <w:r>
         <w:t xml:space="preserve"> </w:t>
@@ -11782,7 +12529,7 @@
         <w:t xml:space="preserve"> </w:t>
       </w:r>
       <w:r>
-        <w:t xml:space="preserve">blindness. Switching to a colour-blind-safe palette (e.g. blue and</w:t>
+        <w:t xml:space="preserve">blindness. Switching to a colour-blind-safe palette (e.g. blue and</w:t>
       </w:r>
       <w:r>
         <w:t xml:space="preserve"> </w:t>
@@ -11803,6 +12550,15 @@
       <w:pPr>
         <w:pStyle w:val="Heading3"/>
       </w:pPr>
+      <w:r>
+        <w:rPr>
+          <w:rStyle w:val="SectionNumber"/>
+        </w:rPr>
+        <w:t xml:space="preserve">4.2.4</w:t>
+      </w:r>
+      <w:r>
+        <w:tab/>
+      </w:r>
       <w:r>
         <w:t xml:space="preserve">Implementation challenges and mitigations</w:t>
       </w:r>
@@ -11832,7 +12588,16 @@
         <w:t xml:space="preserve"> </w:t>
       </w:r>
       <w:r>
-        <w:t xml:space="preserve">path of "compute route → present route". Mitigation: synthesise</w:t>
+        <w:t xml:space="preserve">path of</w:t>
+      </w:r>
+      <w:r>
+        <w:t xml:space="preserve"> </w:t>
+      </w:r>
+      <w:r>
+        <w:t xml:space="preserve">“compute route → present route”</w:t>
+      </w:r>
+      <w:r>
+        <w:t xml:space="preserve">. Mitigation: synthesise</w:t>
       </w:r>
       <w:r>
         <w:t xml:space="preserve"> </w:t>
@@ -11878,7 +12643,7 @@
         <w:t xml:space="preserve"> </w:t>
       </w:r>
       <w:r>
-        <w:t xml:space="preserve">the bundle matching the user's locale at install time; lazy-load</w:t>
+        <w:t xml:space="preserve">the bundle matching the user’s locale at install time; lazy-load</w:t>
       </w:r>
       <w:r>
         <w:t xml:space="preserve"> </w:t>
@@ -11944,7 +12709,10 @@
         <w:t xml:space="preserve"> </w:t>
       </w:r>
       <w:r>
-        <w:t xml:space="preserve">"accessibility module": they are continuous design choices that, made</w:t>
+        <w:t xml:space="preserve">“accessibility module”</w:t>
+      </w:r>
+      <w:r>
+        <w:t xml:space="preserve">: they are continuous design choices that, made</w:t>
       </w:r>
       <w:r>
         <w:t xml:space="preserve"> </w:t>
@@ -12021,11 +12789,20 @@
     </w:p>
     <w:bookmarkEnd w:id="64"/>
     <w:bookmarkEnd w:id="65"/>
-    <w:bookmarkStart w:id="69" w:name="X9776a048810ee8a5097d1031e90dcd81ab7293b"/>
+    <w:bookmarkStart w:id="69" w:name="X79e7dde30d07d1cc6f502741db8d1ade1f743c0"/>
     <w:p>
       <w:pPr>
         <w:pStyle w:val="Heading2"/>
       </w:pPr>
+      <w:r>
+        <w:rPr>
+          <w:rStyle w:val="SectionNumber"/>
+        </w:rPr>
+        <w:t xml:space="preserve">4.3</w:t>
+      </w:r>
+      <w:r>
+        <w:tab/>
+      </w:r>
       <w:r>
         <w:t xml:space="preserve">4.3 Life-long Learning and Future Improvement</w:t>
       </w:r>
@@ -12035,6 +12812,15 @@
       <w:pPr>
         <w:pStyle w:val="Heading3"/>
       </w:pPr>
+      <w:r>
+        <w:rPr>
+          <w:rStyle w:val="SectionNumber"/>
+        </w:rPr>
+        <w:t xml:space="preserve">4.3.1</w:t>
+      </w:r>
+      <w:r>
+        <w:tab/>
+      </w:r>
       <w:r>
         <w:t xml:space="preserve">What this project taught us about life-long learning</w:t>
       </w:r>
@@ -12352,6 +13138,15 @@
         <w:pStyle w:val="Heading3"/>
       </w:pPr>
       <w:r>
+        <w:rPr>
+          <w:rStyle w:val="SectionNumber"/>
+        </w:rPr>
+        <w:t xml:space="preserve">4.3.2</w:t>
+      </w:r>
+      <w:r>
+        <w:tab/>
+      </w:r>
+      <w:r>
         <w:t xml:space="preserve">Contribution as a developer in a team</w:t>
       </w:r>
     </w:p>
@@ -12409,7 +13204,7 @@
         <w:t xml:space="preserve"> </w:t>
       </w:r>
       <w:r>
-        <w:t xml:space="preserve">three-decimal output) that made Task A's analysis possible.</w:t>
+        <w:t xml:space="preserve">three-decimal output) that made Task A’s analysis possible.</w:t>
       </w:r>
     </w:p>
     <w:p>
@@ -12513,6 +13308,15 @@
         <w:pStyle w:val="Heading3"/>
       </w:pPr>
       <w:r>
+        <w:rPr>
+          <w:rStyle w:val="SectionNumber"/>
+        </w:rPr>
+        <w:t xml:space="preserve">4.3.3</w:t>
+      </w:r>
+      <w:r>
+        <w:tab/>
+      </w:r>
+      <w:r>
         <w:t xml:space="preserve">Next steps if the system were developed further</w:t>
       </w:r>
     </w:p>
@@ -12588,7 +13392,7 @@
         <w:t xml:space="preserve"> </w:t>
       </w:r>
       <w:r>
-        <w:t xml:space="preserve">timestamp and to make Dijkstra's relaxation aware of the time at</w:t>
+        <w:t xml:space="preserve">timestamp and to make Dijkstra’s relaxation aware of the time at</w:t>
       </w:r>
       <w:r>
         <w:t xml:space="preserve"> </w:t>
@@ -12738,7 +13542,7 @@
         <w:t xml:space="preserve">findVia</w:t>
       </w:r>
       <w:r>
-        <w:t xml:space="preserve">'s segment-wise stitching is not</w:t>
+        <w:t xml:space="preserve">’s segment-wise stitching is not</w:t>
       </w:r>
       <w:r>
         <w:t xml:space="preserve"> </w:t>
@@ -12832,11 +13636,20 @@
     <w:bookmarkEnd w:id="68"/>
     <w:bookmarkEnd w:id="69"/>
     <w:bookmarkEnd w:id="70"/>
-    <w:bookmarkStart w:id="84" w:name="chapter-5--program-code"/>
+    <w:bookmarkStart w:id="84" w:name="chapter-5-program-code"/>
     <w:p>
       <w:pPr>
         <w:pStyle w:val="Heading1"/>
       </w:pPr>
+      <w:r>
+        <w:rPr>
+          <w:rStyle w:val="SectionNumber"/>
+        </w:rPr>
+        <w:t xml:space="preserve">5</w:t>
+      </w:r>
+      <w:r>
+        <w:tab/>
+      </w:r>
       <w:r>
         <w:t xml:space="preserve">Chapter 5 — Program Code</w:t>
       </w:r>
@@ -13037,11 +13850,20 @@
         <w:t xml:space="preserve">)</w:t>
       </w:r>
     </w:p>
-    <w:bookmarkStart w:id="71" w:name="srcmainjavaappmainjava"/>
+    <w:bookmarkStart w:id="71" w:name="srcmainjavaappmain.java"/>
     <w:p>
       <w:pPr>
         <w:pStyle w:val="Heading2"/>
       </w:pPr>
+      <w:r>
+        <w:rPr>
+          <w:rStyle w:val="SectionNumber"/>
+        </w:rPr>
+        <w:t xml:space="preserve">5.1</w:t>
+      </w:r>
+      <w:r>
+        <w:tab/>
+      </w:r>
       <w:r>
         <w:t xml:space="preserve">src/main/java/app/Main.java</w:t>
       </w:r>
@@ -19871,11 +20693,20 @@
       </w:r>
     </w:p>
     <w:bookmarkEnd w:id="71"/>
-    <w:bookmarkStart w:id="72" w:name="srcmainjavaiocsvreaderjava"/>
+    <w:bookmarkStart w:id="72" w:name="srcmainjavaiocsvreader.java"/>
     <w:p>
       <w:pPr>
         <w:pStyle w:val="Heading2"/>
       </w:pPr>
+      <w:r>
+        <w:rPr>
+          <w:rStyle w:val="SectionNumber"/>
+        </w:rPr>
+        <w:t xml:space="preserve">5.2</w:t>
+      </w:r>
+      <w:r>
+        <w:tab/>
+      </w:r>
       <w:r>
         <w:t xml:space="preserve">src/main/java/io/CsvReader.java</w:t>
       </w:r>
@@ -24509,11 +25340,20 @@
       </w:r>
     </w:p>
     <w:bookmarkEnd w:id="72"/>
-    <w:bookmarkStart w:id="73" w:name="srcmainjavamodelcandidatejava"/>
+    <w:bookmarkStart w:id="73" w:name="srcmainjavamodelcandidate.java"/>
     <w:p>
       <w:pPr>
         <w:pStyle w:val="Heading2"/>
       </w:pPr>
+      <w:r>
+        <w:rPr>
+          <w:rStyle w:val="SectionNumber"/>
+        </w:rPr>
+        <w:t xml:space="preserve">5.3</w:t>
+      </w:r>
+      <w:r>
+        <w:tab/>
+      </w:r>
       <w:r>
         <w:t xml:space="preserve">src/main/java/model/Candidate.java</w:t>
       </w:r>
@@ -26438,11 +27278,20 @@
       </w:r>
     </w:p>
     <w:bookmarkEnd w:id="73"/>
-    <w:bookmarkStart w:id="74" w:name="srcmainjavamodeledgejava"/>
+    <w:bookmarkStart w:id="74" w:name="srcmainjavamodeledge.java"/>
     <w:p>
       <w:pPr>
         <w:pStyle w:val="Heading2"/>
       </w:pPr>
+      <w:r>
+        <w:rPr>
+          <w:rStyle w:val="SectionNumber"/>
+        </w:rPr>
+        <w:t xml:space="preserve">5.4</w:t>
+      </w:r>
+      <w:r>
+        <w:tab/>
+      </w:r>
       <w:r>
         <w:t xml:space="preserve">src/main/java/model/Edge.java</w:t>
       </w:r>
@@ -28034,11 +28883,20 @@
       </w:r>
     </w:p>
     <w:bookmarkEnd w:id="74"/>
-    <w:bookmarkStart w:id="75" w:name="srcmainjavasortsorterjava"/>
+    <w:bookmarkStart w:id="75" w:name="srcmainjavasortsorter.java"/>
     <w:p>
       <w:pPr>
         <w:pStyle w:val="Heading2"/>
       </w:pPr>
+      <w:r>
+        <w:rPr>
+          <w:rStyle w:val="SectionNumber"/>
+        </w:rPr>
+        <w:t xml:space="preserve">5.5</w:t>
+      </w:r>
+      <w:r>
+        <w:tab/>
+      </w:r>
       <w:r>
         <w:t xml:space="preserve">src/main/java/sort/Sorter.java</w:t>
       </w:r>
@@ -28871,11 +29729,20 @@
       </w:r>
     </w:p>
     <w:bookmarkEnd w:id="75"/>
-    <w:bookmarkStart w:id="76" w:name="srcmainjavasortbubblesortjava"/>
+    <w:bookmarkStart w:id="76" w:name="srcmainjavasortbubblesort.java"/>
     <w:p>
       <w:pPr>
         <w:pStyle w:val="Heading2"/>
       </w:pPr>
+      <w:r>
+        <w:rPr>
+          <w:rStyle w:val="SectionNumber"/>
+        </w:rPr>
+        <w:t xml:space="preserve">5.6</w:t>
+      </w:r>
+      <w:r>
+        <w:tab/>
+      </w:r>
       <w:r>
         <w:t xml:space="preserve">src/main/java/sort/BubbleSort.java</w:t>
       </w:r>
@@ -30353,11 +31220,20 @@
       </w:r>
     </w:p>
     <w:bookmarkEnd w:id="76"/>
-    <w:bookmarkStart w:id="77" w:name="srcmainjavasortmergesortjava"/>
+    <w:bookmarkStart w:id="77" w:name="srcmainjavasortmergesort.java"/>
     <w:p>
       <w:pPr>
         <w:pStyle w:val="Heading2"/>
       </w:pPr>
+      <w:r>
+        <w:rPr>
+          <w:rStyle w:val="SectionNumber"/>
+        </w:rPr>
+        <w:t xml:space="preserve">5.7</w:t>
+      </w:r>
+      <w:r>
+        <w:tab/>
+      </w:r>
       <w:r>
         <w:t xml:space="preserve">src/main/java/sort/MergeSort.java</w:t>
       </w:r>
@@ -33629,11 +34505,20 @@
       </w:r>
     </w:p>
     <w:bookmarkEnd w:id="77"/>
-    <w:bookmarkStart w:id="78" w:name="srcmainjavasortquicksortjava"/>
+    <w:bookmarkStart w:id="78" w:name="srcmainjavasortquicksort.java"/>
     <w:p>
       <w:pPr>
         <w:pStyle w:val="Heading2"/>
       </w:pPr>
+      <w:r>
+        <w:rPr>
+          <w:rStyle w:val="SectionNumber"/>
+        </w:rPr>
+        <w:t xml:space="preserve">5.8</w:t>
+      </w:r>
+      <w:r>
+        <w:tab/>
+      </w:r>
       <w:r>
         <w:t xml:space="preserve">src/main/java/sort/QuickSort.java</w:t>
       </w:r>
@@ -37697,11 +38582,20 @@
       </w:r>
     </w:p>
     <w:bookmarkEnd w:id="78"/>
-    <w:bookmarkStart w:id="79" w:name="srcmainjavasortsortbenchmarkjava"/>
+    <w:bookmarkStart w:id="79" w:name="srcmainjavasortsortbenchmark.java"/>
     <w:p>
       <w:pPr>
         <w:pStyle w:val="Heading2"/>
       </w:pPr>
+      <w:r>
+        <w:rPr>
+          <w:rStyle w:val="SectionNumber"/>
+        </w:rPr>
+        <w:t xml:space="preserve">5.9</w:t>
+      </w:r>
+      <w:r>
+        <w:tab/>
+      </w:r>
       <w:r>
         <w:t xml:space="preserve">src/main/java/sort/SortBenchmark.java</w:t>
       </w:r>
@@ -41684,11 +42578,20 @@
       </w:r>
     </w:p>
     <w:bookmarkEnd w:id="79"/>
-    <w:bookmarkStart w:id="80" w:name="srcmainjavagraphgraphjava"/>
+    <w:bookmarkStart w:id="80" w:name="srcmainjavagraphgraph.java"/>
     <w:p>
       <w:pPr>
         <w:pStyle w:val="Heading2"/>
       </w:pPr>
+      <w:r>
+        <w:rPr>
+          <w:rStyle w:val="SectionNumber"/>
+        </w:rPr>
+        <w:t xml:space="preserve">5.10</w:t>
+      </w:r>
+      <w:r>
+        <w:tab/>
+      </w:r>
       <w:r>
         <w:t xml:space="preserve">src/main/java/graph/Graph.java</w:t>
       </w:r>
@@ -45185,11 +46088,20 @@
       </w:r>
     </w:p>
     <w:bookmarkEnd w:id="80"/>
-    <w:bookmarkStart w:id="81" w:name="srcmainjavagraphpathresultjava"/>
+    <w:bookmarkStart w:id="81" w:name="srcmainjavagraphpathresult.java"/>
     <w:p>
       <w:pPr>
         <w:pStyle w:val="Heading2"/>
       </w:pPr>
+      <w:r>
+        <w:rPr>
+          <w:rStyle w:val="SectionNumber"/>
+        </w:rPr>
+        <w:t xml:space="preserve">5.11</w:t>
+      </w:r>
+      <w:r>
+        <w:tab/>
+      </w:r>
       <w:r>
         <w:t xml:space="preserve">src/main/java/graph/PathResult.java</w:t>
       </w:r>
@@ -47618,11 +48530,20 @@
       </w:r>
     </w:p>
     <w:bookmarkEnd w:id="81"/>
-    <w:bookmarkStart w:id="82" w:name="srcmainjavagraphshortestpathfinderjava"/>
+    <w:bookmarkStart w:id="82" w:name="srcmainjavagraphshortestpathfinder.java"/>
     <w:p>
       <w:pPr>
         <w:pStyle w:val="Heading2"/>
       </w:pPr>
+      <w:r>
+        <w:rPr>
+          <w:rStyle w:val="SectionNumber"/>
+        </w:rPr>
+        <w:t xml:space="preserve">5.12</w:t>
+      </w:r>
+      <w:r>
+        <w:tab/>
+      </w:r>
       <w:r>
         <w:t xml:space="preserve">src/main/java/graph/ShortestPathFinder.java</w:t>
       </w:r>
@@ -50144,11 +51065,20 @@
       </w:r>
     </w:p>
     <w:bookmarkEnd w:id="82"/>
-    <w:bookmarkStart w:id="83" w:name="srcmainjavagraphdijkstrashortestpathjava"/>
+    <w:bookmarkStart w:id="83" w:name="X3ab95b695596401b81c631e792f77843d44a7a1"/>
     <w:p>
       <w:pPr>
         <w:pStyle w:val="Heading2"/>
       </w:pPr>
+      <w:r>
+        <w:rPr>
+          <w:rStyle w:val="SectionNumber"/>
+        </w:rPr>
+        <w:t xml:space="preserve">5.13</w:t>
+      </w:r>
+      <w:r>
+        <w:tab/>
+      </w:r>
       <w:r>
         <w:t xml:space="preserve">src/main/java/graph/DijkstraShortestPath.java</w:t>
       </w:r>
@@ -54426,20 +55356,38 @@
     </w:p>
     <w:bookmarkEnd w:id="83"/>
     <w:bookmarkEnd w:id="84"/>
-    <w:bookmarkStart w:id="90" w:name="chapter-6--appendix"/>
+    <w:bookmarkStart w:id="90" w:name="chapter-6-appendix"/>
     <w:p>
       <w:pPr>
         <w:pStyle w:val="Heading1"/>
       </w:pPr>
       <w:r>
+        <w:rPr>
+          <w:rStyle w:val="SectionNumber"/>
+        </w:rPr>
+        <w:t xml:space="preserve">6</w:t>
+      </w:r>
+      <w:r>
+        <w:tab/>
+      </w:r>
+      <w:r>
         <w:t xml:space="preserve">Chapter 6 — Appendix</w:t>
       </w:r>
     </w:p>
-    <w:bookmarkStart w:id="85" w:name="a-console-output-of-appmain"/>
+    <w:bookmarkStart w:id="85" w:name="a.-console-output-of-app.main"/>
     <w:p>
       <w:pPr>
         <w:pStyle w:val="Heading2"/>
       </w:pPr>
+      <w:r>
+        <w:rPr>
+          <w:rStyle w:val="SectionNumber"/>
+        </w:rPr>
+        <w:t xml:space="preserve">6.1</w:t>
+      </w:r>
+      <w:r>
+        <w:tab/>
+      </w:r>
       <w:r>
         <w:t xml:space="preserve">A. Console output of</w:t>
       </w:r>
@@ -55053,11 +56001,20 @@
       </w:r>
     </w:p>
     <w:bookmarkEnd w:id="85"/>
-    <w:bookmarkStart w:id="86" w:name="b-uml-diagrams-referenced-from-chapter-3"/>
+    <w:bookmarkStart w:id="86" w:name="X2d01ef38a4906b3c0fb5b498015a3cfccb252b1"/>
     <w:p>
       <w:pPr>
         <w:pStyle w:val="Heading2"/>
       </w:pPr>
+      <w:r>
+        <w:rPr>
+          <w:rStyle w:val="SectionNumber"/>
+        </w:rPr>
+        <w:t xml:space="preserve">6.2</w:t>
+      </w:r>
+      <w:r>
+        <w:tab/>
+      </w:r>
       <w:r>
         <w:t xml:space="preserve">B. UML diagrams referenced from Chapter 3</w:t>
       </w:r>
@@ -55207,11 +56164,20 @@
       </w:r>
     </w:p>
     <w:bookmarkEnd w:id="86"/>
-    <w:bookmarkStart w:id="87" w:name="X4e953fdbc4143f6dc8e8945c9c6b3552e0f6f8d"/>
+    <w:bookmarkStart w:id="87" w:name="X7a621df5624ec79e69090ca1f53cddab64f67db"/>
     <w:p>
       <w:pPr>
         <w:pStyle w:val="Heading2"/>
       </w:pPr>
+      <w:r>
+        <w:rPr>
+          <w:rStyle w:val="SectionNumber"/>
+        </w:rPr>
+        <w:t xml:space="preserve">6.3</w:t>
+      </w:r>
+      <w:r>
+        <w:tab/>
+      </w:r>
       <w:r>
         <w:t xml:space="preserve">C. Trello board screenshots referenced from Chapter 4</w:t>
       </w:r>
@@ -55283,11 +56249,20 @@
       </w:r>
     </w:p>
     <w:bookmarkEnd w:id="87"/>
-    <w:bookmarkStart w:id="88" w:name="d-citation-of-ai-tools-used"/>
+    <w:bookmarkStart w:id="88" w:name="d.-citation-of-ai-tools-used"/>
     <w:p>
       <w:pPr>
         <w:pStyle w:val="Heading2"/>
       </w:pPr>
+      <w:r>
+        <w:rPr>
+          <w:rStyle w:val="SectionNumber"/>
+        </w:rPr>
+        <w:t xml:space="preserve">6.4</w:t>
+      </w:r>
+      <w:r>
+        <w:tab/>
+      </w:r>
       <w:r>
         <w:t xml:space="preserve">D. Citation of AI tools used</w:t>
       </w:r>
@@ -55297,7 +56272,7 @@
         <w:pStyle w:val="FirstParagraph"/>
       </w:pPr>
       <w:r>
-        <w:t xml:space="preserve">In line with the module's academic-integrity policy, all AI assistance</w:t>
+        <w:t xml:space="preserve">In line with the module’s academic-integrity policy, all AI assistance</w:t>
       </w:r>
       <w:r>
         <w:t xml:space="preserve"> </w:t>
@@ -55315,7 +56290,7 @@
         <w:t xml:space="preserve"> </w:t>
       </w:r>
       <w:r>
-        <w:t xml:space="preserve">verification against the authoritative sources (Liang's textbook and</w:t>
+        <w:t xml:space="preserve">verification against the authoritative sources (Liang’s textbook and</w:t>
       </w:r>
       <w:r>
         <w:t xml:space="preserve"> </w:t>
@@ -55333,11 +56308,20 @@
       </w:r>
     </w:p>
     <w:bookmarkEnd w:id="88"/>
-    <w:bookmarkStart w:id="89" w:name="e-source-code-repository-layout"/>
+    <w:bookmarkStart w:id="89" w:name="e.-source-code-repository-layout"/>
     <w:p>
       <w:pPr>
         <w:pStyle w:val="Heading2"/>
       </w:pPr>
+      <w:r>
+        <w:rPr>
+          <w:rStyle w:val="SectionNumber"/>
+        </w:rPr>
+        <w:t xml:space="preserve">6.5</w:t>
+      </w:r>
+      <w:r>
+        <w:tab/>
+      </w:r>
       <w:r>
         <w:t xml:space="preserve">E. Source-code repository layout</w:t>
       </w:r>
@@ -55516,11 +56500,20 @@
     </w:p>
     <w:bookmarkEnd w:id="89"/>
     <w:bookmarkEnd w:id="90"/>
-    <w:bookmarkStart w:id="92" w:name="chapter-7--contribution-form"/>
+    <w:bookmarkStart w:id="92" w:name="chapter-7-contribution-form"/>
     <w:p>
       <w:pPr>
         <w:pStyle w:val="Heading1"/>
       </w:pPr>
+      <w:r>
+        <w:rPr>
+          <w:rStyle w:val="SectionNumber"/>
+        </w:rPr>
+        <w:t xml:space="preserve">7</w:t>
+      </w:r>
+      <w:r>
+        <w:tab/>
+      </w:r>
       <w:r>
         <w:t xml:space="preserve">Chapter 7 — Contribution Form</w:t>
       </w:r>
@@ -55548,7 +56541,8 @@
     <w:tbl>
       <w:tblPr>
         <w:tblStyle w:val="Table"/>
-        <w:tblW w:type="auto" w:w="0"/>
+        <w:tblW w:type="pct" w:w="5000"/>
+        <w:tblLayout w:type="fixed"/>
         <w:tblLook w:firstRow="1" w:lastRow="0" w:firstColumn="0" w:lastColumn="0" w:noHBand="0" w:noVBand="0" w:val="0020"/>
       </w:tblPr>
       <w:tblGrid>
@@ -55699,6 +56693,15 @@
         <w:pStyle w:val="Heading2"/>
       </w:pPr>
       <w:r>
+        <w:rPr>
+          <w:rStyle w:val="SectionNumber"/>
+        </w:rPr>
+        <w:t xml:space="preserve">7.1</w:t>
+      </w:r>
+      <w:r>
+        <w:tab/>
+      </w:r>
+      <w:r>
         <w:t xml:space="preserve">Indicative split of work</w:t>
       </w:r>
     </w:p>
@@ -55729,7 +56732,7 @@
         <w:t xml:space="preserve"> </w:t>
       </w:r>
       <w:r>
-        <w:t xml:space="preserve">focused on, intended to satisfy the marker's request for a contribution</w:t>
+        <w:t xml:space="preserve">focused on, intended to satisfy the marker’s request for a contribution</w:t>
       </w:r>
       <w:r>
         <w:t xml:space="preserve"> </w:t>

</xml_diff>